<commit_message>
4.1: tahlil davri 2021–2025 aniq ko'rsatildi, 4.1.3-rasm 2021_IV–2025_IV
Co-Authored-By: Claude Opus 5.5 <noreply@anthropic.com>
Claude-Session: https://claude.ai/code/session_01PxHTC8Q7yHdrpAeUA5KUgM
</commit_message>
<xml_diff>
--- a/paragraflar/4.1-paragraf.docx
+++ b/paragraflar/4.1-paragraf.docx
@@ -1573,7 +1573,7 @@
           <w:rFonts w:ascii="Times New Roman" w:hAnsi="Times New Roman" w:cs="Times New Roman" w:eastAsia="Times New Roman"/>
           <w:sz w:val="28"/>
         </w:rPr>
-        <w:t xml:space="preserve">Bashorat masalasi quyidagicha qo‘yildi: har bir bank-chorak kuzatuvi uchun bank keyingi to‘rt chorak ichida muammo hodisasiga uchraydimi yoki yo‘qmi, aniqlanadi. To‘rt chorak muddat nazorat organi va bank rahbariyatiga tuzatish choralarini ko‘rish uchun yetarli vaqtni ta’minlaydi. Hodisa yuz bergan chorakning o‘zi tahlildan chiqarildi, bashorat oynasi to‘liq kuzatilishi uchun esa 2024-yil IV choragigacha bo‘lgan kuzatuvlar olindi. Natijada 308 ta kuzatuv shakllandi, ulardan 26 tasi, ya’ni 8,4 foizi muammo hodisasidan oldingi davrga to‘g‘ri keladi. Ko‘rsatkichlarning bashorat kuchi ROC egri chizig‘i ostidagi maydon (AUC) bilan o‘lchandi</w:t>
+        <w:t xml:space="preserve">Bashorat masalasi quyidagicha qo‘yildi: har bir bank-chorak kuzatuvi uchun bank keyingi to‘rt chorak ichida muammo hodisasiga uchraydimi yoki yo‘qmi, aniqlanadi. To‘rt chorak muddat nazorat organi va bank rahbariyatiga tuzatish choralarini ko‘rish uchun yetarli vaqtni ta’minlaydi. Tahlil davri 2021–2025-yillarni qamraydi: muammo hodisalari 2021-yil IV choragidan 2025-yil IV choragigacha bo‘lgan davrda aniqlandi, bashorat qiluvchi ko‘rsatkichlar sifatida esa 2021-yil IV choragidan 2024-yil IV choragigacha bo‘lgan kuzatuvlar olindi, chunki 2025-yil kuzatuvlari uchun keyingi to‘rt chorak 2026-yilga to‘g‘ri keladi va tahlil davridan tashqarida bo‘ladi. Hodisa yuz bergan chorakning o‘zi tahlildan chiqarildi. Natijada 308 ta kuzatuv shakllandi, ulardan 26 tasi, ya’ni 8,4 foizi muammo hodisasidan oldingi davrga to‘g‘ri keladi. Ko‘rsatkichlarning bashorat kuchi ROC egri chizig‘i ostidagi maydon (AUC) bilan o‘lchandi</w:t>
       </w:r>
       <w:r>
         <w:rPr>
@@ -5400,7 +5400,7 @@
           <w:b/>
           <w:sz w:val="28"/>
         </w:rPr>
-        <w:t xml:space="preserve">4.1.3-rasm. «Mikrokreditbank» ATB va «Biznesni rivojlantirish banki» ATB da integral indeks dinamikasi va erta ogohlantirish chegaralari, 2023–2025-yillar</w:t>
+        <w:t xml:space="preserve">4.1.3-rasm. «Mikrokreditbank» ATB va «Biznesni rivojlantirish banki» ATB da integral indeks dinamikasi va erta ogohlantirish chegaralari, 2021–2025-yillar</w:t>
       </w:r>
       <w:r>
         <w:rPr>
@@ -5421,7 +5421,7 @@
           <w:rFonts w:ascii="Times New Roman" w:hAnsi="Times New Roman" w:cs="Times New Roman" w:eastAsia="Times New Roman"/>
           <w:sz w:val="28"/>
         </w:rPr>
-        <w:t xml:space="preserve">Rasmdan ko‘rinib turibdiki, ikkala bankda ham integral indeks 2024-yil IV choragidagi yirik zararlardan ancha oldin qizil zonada bo‘lgan. «Mikrokreditbank» ATB ning indeksi 2023-yil davomida 2,65–2,69 ballni tashkil etib, 2,75 ballik chegaradan pastda bo‘lgan, 2024-yil II–III choraklarida esa 2,36–2,38 ballgacha keskin pasaygan, ya’ni zarar tan olinishidan ikki chorak oldin qo‘shimcha signal bergan. «Biznesni rivojlantirish banki» ATB ning indeksi 2023-yil III choragidagi 2,64 balldan 2023-yil IV choragida 2,44 ballgacha va 2024-yil I choragida 2,20 ballgacha pasaygan. Bu signal bankning 2024-yil I choragidagi 394,0 mlrd so‘mlik va IV choragidagi 1 952,0 mlrd so‘mlik zararlaridan oldin berilgan. Ikkala bankda ham zarar va qayta kapitallashtirishdan keyin indeks 2025-yilda oshgan, «Biznesni rivojlantirish banki» ATB da esa 3,15–3,28 ballgacha ko‘tarilib, yashil zona chegarasiga yetgan. Xuddi shunday signal «Garant bank» ATB da (2024-yil II–III choraklarida 2,55–2,57 ball), «Ipoteka-bank» ATB da (2024-yil III choragida 2,50 ball) va «Xalq banki» ATB da (2022-yilda 2,35–2,51 ball) ham kuzatilgan. Integral indeks o‘tkazib yuborgan yagona yirik hodisa «Tibisi bank» ATB ning 2022-yildagi zararlaridir: bank faoliyatining dastlabki bosqichida yuqori daromadlilik va kam muammoli kreditlar bilan indeksi 3,83 ballni tashkil etgan, zarar esa bank faoliyatining dastlabki bosqichidagi xarajatlar bilan bog‘liq bo‘lishi mumkin. Bu holat erta ogohlantirish tizimida integral indeks bilan bir qatorda kreditlar o‘sish sur’atini ham kuzatish lozimligini ko‘rsatadi.</w:t>
+        <w:t xml:space="preserve">Rasmdan ko‘rinib turibdiki, ikkala bankda ham integral indeks 2024-yil IV choragidagi yirik zararlardan ancha oldin qizil zonada bo‘lgan. «Mikrokreditbank» ATB ning indeksi 2021–2023-yillarda 2,65–2,82 ballni tashkil etib, deyarli barcha choraklarda 2,75 ballik chegaradan pastda bo‘lgan, 2024-yil II–III choraklarida esa 2,36–2,38 ballgacha keskin pasaygan, ya’ni zarar tan olinishidan ikki chorak oldin qo‘shimcha signal bergan. «Biznesni rivojlantirish banki» ATB ning indeksi 2022-yilda 2,67–2,93 ballni tashkil etgan bo‘lsa, 2023-yil III choragidagi 2,64 balldan 2023-yil IV choragida 2,44 ballgacha va 2024-yil I choragida 2,20 ballgacha pasaygan. Bu signal bankning 2024-yil I choragidagi 394,0 mlrd so‘mlik va IV choragidagi 1 952,0 mlrd so‘mlik zararlaridan oldin berilgan. Ikkala bankda ham zarar va qayta kapitallashtirishdan keyin indeks 2025-yilda oshgan, «Biznesni rivojlantirish banki» ATB da esa 3,15–3,28 ballgacha ko‘tarilib, yashil zona chegarasiga yetgan. Xuddi shunday signal «Garant bank» ATB da (2024-yil II–III choraklarida 2,55–2,57 ball), «Ipoteka-bank» ATB da (2024-yil III choragida 2,50 ball) va «Xalq banki» ATB da (2022-yilda 2,35–2,51 ball) ham kuzatilgan. Integral indeks o‘tkazib yuborgan yagona yirik hodisa «Tibisi bank» ATB ning 2022-yildagi zararlaridir: bank faoliyatining dastlabki bosqichida yuqori daromadlilik va kam muammoli kreditlar bilan indeksi 3,83 ballni tashkil etgan, zarar esa bank faoliyatining dastlabki bosqichidagi xarajatlar bilan bog‘liq bo‘lishi mumkin. Bu holat erta ogohlantirish tizimida integral indeks bilan bir qatorda kreditlar o‘sish sur’atini ham kuzatish lozimligini ko‘rsatadi.</w:t>
       </w:r>
     </w:p>
     <w:p>
@@ -8908,6 +8908,14 @@
               <c:delete val="1"/>
             </c:dLbl>
             <c:dLbl>
+              <c:idx val="5"/>
+              <c:delete val="1"/>
+            </c:dLbl>
+            <c:dLbl>
+              <c:idx val="6"/>
+              <c:delete val="1"/>
+            </c:dLbl>
+            <c:dLbl>
               <c:idx val="7"/>
               <c:delete val="1"/>
             </c:dLbl>
@@ -8924,7 +8932,19 @@
               <c:delete val="1"/>
             </c:dLbl>
             <c:dLbl>
-              <c:idx val="11"/>
+              <c:idx val="13"/>
+              <c:delete val="1"/>
+            </c:dLbl>
+            <c:dLbl>
+              <c:idx val="14"/>
+              <c:delete val="1"/>
+            </c:dLbl>
+            <c:dLbl>
+              <c:idx val="15"/>
+              <c:delete val="1"/>
+            </c:dLbl>
+            <c:dLbl>
+              <c:idx val="16"/>
               <c:delete val="1"/>
             </c:dLbl>
             <c:spPr>
@@ -8959,44 +8979,59 @@
           </c:dLbls>
           <c:xVal>
             <c:numRef>
-              <c:f>Sheet1!$A$2:$A$13</c:f>
+              <c:f>Sheet1!$A$2:$A$18</c:f>
               <c:numCache>
                 <c:formatCode>General</c:formatCode>
-                <c:ptCount val="12"/>
+                <c:ptCount val="17"/>
                 <c:pt idx="0">
+                  <c:v>2021.75</c:v>
+                </c:pt>
+                <c:pt idx="1">
+                  <c:v>2022</c:v>
+                </c:pt>
+                <c:pt idx="2">
+                  <c:v>2022.25</c:v>
+                </c:pt>
+                <c:pt idx="3">
+                  <c:v>2022.5</c:v>
+                </c:pt>
+                <c:pt idx="4">
+                  <c:v>2022.75</c:v>
+                </c:pt>
+                <c:pt idx="5">
                   <c:v>2023</c:v>
                 </c:pt>
-                <c:pt idx="1">
+                <c:pt idx="6">
                   <c:v>2023.25</c:v>
                 </c:pt>
-                <c:pt idx="2">
+                <c:pt idx="7">
                   <c:v>2023.5</c:v>
                 </c:pt>
-                <c:pt idx="3">
+                <c:pt idx="8">
                   <c:v>2023.75</c:v>
                 </c:pt>
-                <c:pt idx="4">
+                <c:pt idx="9">
                   <c:v>2024</c:v>
                 </c:pt>
-                <c:pt idx="5">
+                <c:pt idx="10">
                   <c:v>2024.25</c:v>
                 </c:pt>
-                <c:pt idx="6">
+                <c:pt idx="11">
                   <c:v>2024.5</c:v>
                 </c:pt>
-                <c:pt idx="7">
+                <c:pt idx="12">
                   <c:v>2024.75</c:v>
                 </c:pt>
-                <c:pt idx="8">
+                <c:pt idx="13">
                   <c:v>2025</c:v>
                 </c:pt>
-                <c:pt idx="9">
+                <c:pt idx="14">
                   <c:v>2025.25</c:v>
                 </c:pt>
-                <c:pt idx="10">
+                <c:pt idx="15">
                   <c:v>2025.5</c:v>
                 </c:pt>
-                <c:pt idx="11">
+                <c:pt idx="16">
                   <c:v>2025.75</c:v>
                 </c:pt>
               </c:numCache>
@@ -9004,44 +9039,59 @@
           </c:xVal>
           <c:yVal>
             <c:numRef>
-              <c:f>Sheet1!$B$2:$B$13</c:f>
+              <c:f>Sheet1!$B$2:$B$18</c:f>
               <c:numCache>
                 <c:formatCode>General</c:formatCode>
-                <c:ptCount val="12"/>
+                <c:ptCount val="17"/>
                 <c:pt idx="0">
+                  <c:v>2.75</c:v>
+                </c:pt>
+                <c:pt idx="1">
+                  <c:v>2.68</c:v>
+                </c:pt>
+                <c:pt idx="2">
+                  <c:v>2.71</c:v>
+                </c:pt>
+                <c:pt idx="3">
+                  <c:v>2.72</c:v>
+                </c:pt>
+                <c:pt idx="4">
+                  <c:v>2.82</c:v>
+                </c:pt>
+                <c:pt idx="5">
                   <c:v>2.67</c:v>
                 </c:pt>
-                <c:pt idx="1">
+                <c:pt idx="6">
                   <c:v>2.65</c:v>
                 </c:pt>
-                <c:pt idx="2">
+                <c:pt idx="7">
                   <c:v>2.68</c:v>
                 </c:pt>
-                <c:pt idx="3">
+                <c:pt idx="8">
                   <c:v>2.69</c:v>
                 </c:pt>
-                <c:pt idx="4">
+                <c:pt idx="9">
                   <c:v>2.62</c:v>
                 </c:pt>
-                <c:pt idx="5">
+                <c:pt idx="10">
                   <c:v>2.36</c:v>
                 </c:pt>
-                <c:pt idx="6">
+                <c:pt idx="11">
                   <c:v>2.38</c:v>
                 </c:pt>
-                <c:pt idx="7">
+                <c:pt idx="12">
                   <c:v>2.71</c:v>
                 </c:pt>
-                <c:pt idx="8">
+                <c:pt idx="13">
                   <c:v>2.67</c:v>
                 </c:pt>
-                <c:pt idx="9">
+                <c:pt idx="14">
                   <c:v>2.69</c:v>
                 </c:pt>
-                <c:pt idx="10">
+                <c:pt idx="15">
                   <c:v>2.9</c:v>
                 </c:pt>
-                <c:pt idx="11">
+                <c:pt idx="16">
                   <c:v>2.9</c:v>
                 </c:pt>
               </c:numCache>
@@ -9096,6 +9146,14 @@
               <c:delete val="1"/>
             </c:dLbl>
             <c:dLbl>
+              <c:idx val="3"/>
+              <c:delete val="1"/>
+            </c:dLbl>
+            <c:dLbl>
+              <c:idx val="4"/>
+              <c:delete val="1"/>
+            </c:dLbl>
+            <c:dLbl>
               <c:idx val="5"/>
               <c:delete val="1"/>
             </c:dLbl>
@@ -9108,19 +9166,31 @@
               <c:delete val="1"/>
             </c:dLbl>
             <c:dLbl>
-              <c:idx val="8"/>
-              <c:delete val="1"/>
-            </c:dLbl>
-            <c:dLbl>
-              <c:idx val="9"/>
-              <c:delete val="1"/>
-            </c:dLbl>
-            <c:dLbl>
               <c:idx val="10"/>
               <c:delete val="1"/>
             </c:dLbl>
             <c:dLbl>
               <c:idx val="11"/>
+              <c:delete val="1"/>
+            </c:dLbl>
+            <c:dLbl>
+              <c:idx val="12"/>
+              <c:delete val="1"/>
+            </c:dLbl>
+            <c:dLbl>
+              <c:idx val="13"/>
+              <c:delete val="1"/>
+            </c:dLbl>
+            <c:dLbl>
+              <c:idx val="14"/>
+              <c:delete val="1"/>
+            </c:dLbl>
+            <c:dLbl>
+              <c:idx val="15"/>
+              <c:delete val="1"/>
+            </c:dLbl>
+            <c:dLbl>
+              <c:idx val="16"/>
               <c:delete val="1"/>
             </c:dLbl>
             <c:spPr>
@@ -9155,44 +9225,59 @@
           </c:dLbls>
           <c:xVal>
             <c:numRef>
-              <c:f>Sheet1!$C$2:$C$13</c:f>
+              <c:f>Sheet1!$C$2:$C$18</c:f>
               <c:numCache>
                 <c:formatCode>General</c:formatCode>
-                <c:ptCount val="12"/>
+                <c:ptCount val="17"/>
                 <c:pt idx="0">
+                  <c:v>2021.75</c:v>
+                </c:pt>
+                <c:pt idx="1">
+                  <c:v>2022</c:v>
+                </c:pt>
+                <c:pt idx="2">
+                  <c:v>2022.25</c:v>
+                </c:pt>
+                <c:pt idx="3">
+                  <c:v>2022.5</c:v>
+                </c:pt>
+                <c:pt idx="4">
+                  <c:v>2022.75</c:v>
+                </c:pt>
+                <c:pt idx="5">
                   <c:v>2023</c:v>
                 </c:pt>
-                <c:pt idx="1">
+                <c:pt idx="6">
                   <c:v>2023.25</c:v>
                 </c:pt>
-                <c:pt idx="2">
+                <c:pt idx="7">
                   <c:v>2023.5</c:v>
                 </c:pt>
-                <c:pt idx="3">
+                <c:pt idx="8">
                   <c:v>2023.75</c:v>
                 </c:pt>
-                <c:pt idx="4">
+                <c:pt idx="9">
                   <c:v>2024</c:v>
                 </c:pt>
-                <c:pt idx="5">
+                <c:pt idx="10">
                   <c:v>2024.25</c:v>
                 </c:pt>
-                <c:pt idx="6">
+                <c:pt idx="11">
                   <c:v>2024.5</c:v>
                 </c:pt>
-                <c:pt idx="7">
+                <c:pt idx="12">
                   <c:v>2024.75</c:v>
                 </c:pt>
-                <c:pt idx="8">
+                <c:pt idx="13">
                   <c:v>2025</c:v>
                 </c:pt>
-                <c:pt idx="9">
+                <c:pt idx="14">
                   <c:v>2025.25</c:v>
                 </c:pt>
-                <c:pt idx="10">
+                <c:pt idx="15">
                   <c:v>2025.5</c:v>
                 </c:pt>
-                <c:pt idx="11">
+                <c:pt idx="16">
                   <c:v>2025.75</c:v>
                 </c:pt>
               </c:numCache>
@@ -9200,44 +9285,53 @@
           </c:xVal>
           <c:yVal>
             <c:numRef>
-              <c:f>Sheet1!$D$2:$D$13</c:f>
+              <c:f>Sheet1!$D$2:$D$18</c:f>
               <c:numCache>
                 <c:formatCode>General</c:formatCode>
-                <c:ptCount val="12"/>
-                <c:pt idx="0">
+                <c:ptCount val="17"/>
+                <c:pt idx="1">
+                  <c:v>2.67</c:v>
+                </c:pt>
+                <c:pt idx="2">
+                  <c:v>2.71</c:v>
+                </c:pt>
+                <c:pt idx="3">
+                  <c:v>2.93</c:v>
+                </c:pt>
+                <c:pt idx="5">
                   <c:v>2.85</c:v>
                 </c:pt>
-                <c:pt idx="1">
+                <c:pt idx="6">
                   <c:v>2.65</c:v>
                 </c:pt>
-                <c:pt idx="2">
+                <c:pt idx="7">
                   <c:v>2.64</c:v>
                 </c:pt>
-                <c:pt idx="3">
+                <c:pt idx="8">
                   <c:v>2.44</c:v>
                 </c:pt>
-                <c:pt idx="4">
+                <c:pt idx="9">
                   <c:v>2.2</c:v>
                 </c:pt>
-                <c:pt idx="5">
+                <c:pt idx="10">
                   <c:v>2.3</c:v>
                 </c:pt>
-                <c:pt idx="6">
+                <c:pt idx="11">
                   <c:v>2.45</c:v>
                 </c:pt>
-                <c:pt idx="7">
+                <c:pt idx="12">
                   <c:v>2.83</c:v>
                 </c:pt>
-                <c:pt idx="8">
+                <c:pt idx="13">
                   <c:v>3.18</c:v>
                 </c:pt>
-                <c:pt idx="9">
+                <c:pt idx="14">
                   <c:v>3.28</c:v>
                 </c:pt>
-                <c:pt idx="10">
+                <c:pt idx="15">
                   <c:v>3.22</c:v>
                 </c:pt>
-                <c:pt idx="11">
+                <c:pt idx="16">
                   <c:v>3.15</c:v>
                 </c:pt>
               </c:numCache>
@@ -9272,44 +9366,59 @@
           </c:marker>
           <c:xVal>
             <c:numRef>
-              <c:f>Sheet1!$E$2:$E$13</c:f>
+              <c:f>Sheet1!$E$2:$E$18</c:f>
               <c:numCache>
                 <c:formatCode>General</c:formatCode>
-                <c:ptCount val="12"/>
+                <c:ptCount val="17"/>
                 <c:pt idx="0">
+                  <c:v>2021.75</c:v>
+                </c:pt>
+                <c:pt idx="1">
+                  <c:v>2022</c:v>
+                </c:pt>
+                <c:pt idx="2">
+                  <c:v>2022.25</c:v>
+                </c:pt>
+                <c:pt idx="3">
+                  <c:v>2022.5</c:v>
+                </c:pt>
+                <c:pt idx="4">
+                  <c:v>2022.75</c:v>
+                </c:pt>
+                <c:pt idx="5">
                   <c:v>2023</c:v>
                 </c:pt>
-                <c:pt idx="1">
+                <c:pt idx="6">
                   <c:v>2023.25</c:v>
                 </c:pt>
-                <c:pt idx="2">
+                <c:pt idx="7">
                   <c:v>2023.5</c:v>
                 </c:pt>
-                <c:pt idx="3">
+                <c:pt idx="8">
                   <c:v>2023.75</c:v>
                 </c:pt>
-                <c:pt idx="4">
+                <c:pt idx="9">
                   <c:v>2024</c:v>
                 </c:pt>
-                <c:pt idx="5">
+                <c:pt idx="10">
                   <c:v>2024.25</c:v>
                 </c:pt>
-                <c:pt idx="6">
+                <c:pt idx="11">
                   <c:v>2024.5</c:v>
                 </c:pt>
-                <c:pt idx="7">
+                <c:pt idx="12">
                   <c:v>2024.75</c:v>
                 </c:pt>
-                <c:pt idx="8">
+                <c:pt idx="13">
                   <c:v>2025</c:v>
                 </c:pt>
-                <c:pt idx="9">
+                <c:pt idx="14">
                   <c:v>2025.25</c:v>
                 </c:pt>
-                <c:pt idx="10">
+                <c:pt idx="15">
                   <c:v>2025.5</c:v>
                 </c:pt>
-                <c:pt idx="11">
+                <c:pt idx="16">
                   <c:v>2025.75</c:v>
                 </c:pt>
               </c:numCache>
@@ -9317,10 +9426,10 @@
           </c:xVal>
           <c:yVal>
             <c:numRef>
-              <c:f>Sheet1!$F$2:$F$13</c:f>
+              <c:f>Sheet1!$F$2:$F$18</c:f>
               <c:numCache>
                 <c:formatCode>General</c:formatCode>
-                <c:ptCount val="12"/>
+                <c:ptCount val="17"/>
                 <c:pt idx="0">
                   <c:v>2.75</c:v>
                 </c:pt>
@@ -9355,6 +9464,21 @@
                   <c:v>2.75</c:v>
                 </c:pt>
                 <c:pt idx="11">
+                  <c:v>2.75</c:v>
+                </c:pt>
+                <c:pt idx="12">
+                  <c:v>2.75</c:v>
+                </c:pt>
+                <c:pt idx="13">
+                  <c:v>2.75</c:v>
+                </c:pt>
+                <c:pt idx="14">
+                  <c:v>2.75</c:v>
+                </c:pt>
+                <c:pt idx="15">
+                  <c:v>2.75</c:v>
+                </c:pt>
+                <c:pt idx="16">
                   <c:v>2.75</c:v>
                 </c:pt>
               </c:numCache>
@@ -9389,44 +9513,59 @@
           </c:marker>
           <c:xVal>
             <c:numRef>
-              <c:f>Sheet1!$G$2:$G$13</c:f>
+              <c:f>Sheet1!$G$2:$G$18</c:f>
               <c:numCache>
                 <c:formatCode>General</c:formatCode>
-                <c:ptCount val="12"/>
+                <c:ptCount val="17"/>
                 <c:pt idx="0">
+                  <c:v>2021.75</c:v>
+                </c:pt>
+                <c:pt idx="1">
+                  <c:v>2022</c:v>
+                </c:pt>
+                <c:pt idx="2">
+                  <c:v>2022.25</c:v>
+                </c:pt>
+                <c:pt idx="3">
+                  <c:v>2022.5</c:v>
+                </c:pt>
+                <c:pt idx="4">
+                  <c:v>2022.75</c:v>
+                </c:pt>
+                <c:pt idx="5">
                   <c:v>2023</c:v>
                 </c:pt>
-                <c:pt idx="1">
+                <c:pt idx="6">
                   <c:v>2023.25</c:v>
                 </c:pt>
-                <c:pt idx="2">
+                <c:pt idx="7">
                   <c:v>2023.5</c:v>
                 </c:pt>
-                <c:pt idx="3">
+                <c:pt idx="8">
                   <c:v>2023.75</c:v>
                 </c:pt>
-                <c:pt idx="4">
+                <c:pt idx="9">
                   <c:v>2024</c:v>
                 </c:pt>
-                <c:pt idx="5">
+                <c:pt idx="10">
                   <c:v>2024.25</c:v>
                 </c:pt>
-                <c:pt idx="6">
+                <c:pt idx="11">
                   <c:v>2024.5</c:v>
                 </c:pt>
-                <c:pt idx="7">
+                <c:pt idx="12">
                   <c:v>2024.75</c:v>
                 </c:pt>
-                <c:pt idx="8">
+                <c:pt idx="13">
                   <c:v>2025</c:v>
                 </c:pt>
-                <c:pt idx="9">
+                <c:pt idx="14">
                   <c:v>2025.25</c:v>
                 </c:pt>
-                <c:pt idx="10">
+                <c:pt idx="15">
                   <c:v>2025.5</c:v>
                 </c:pt>
-                <c:pt idx="11">
+                <c:pt idx="16">
                   <c:v>2025.75</c:v>
                 </c:pt>
               </c:numCache>
@@ -9434,10 +9573,10 @@
           </c:xVal>
           <c:yVal>
             <c:numRef>
-              <c:f>Sheet1!$H$2:$H$13</c:f>
+              <c:f>Sheet1!$H$2:$H$18</c:f>
               <c:numCache>
                 <c:formatCode>General</c:formatCode>
-                <c:ptCount val="12"/>
+                <c:ptCount val="17"/>
                 <c:pt idx="0">
                   <c:v>3.25</c:v>
                 </c:pt>
@@ -9472,6 +9611,21 @@
                   <c:v>3.25</c:v>
                 </c:pt>
                 <c:pt idx="11">
+                  <c:v>3.25</c:v>
+                </c:pt>
+                <c:pt idx="12">
+                  <c:v>3.25</c:v>
+                </c:pt>
+                <c:pt idx="13">
+                  <c:v>3.25</c:v>
+                </c:pt>
+                <c:pt idx="14">
+                  <c:v>3.25</c:v>
+                </c:pt>
+                <c:pt idx="15">
+                  <c:v>3.25</c:v>
+                </c:pt>
+                <c:pt idx="16">
                   <c:v>3.25</c:v>
                 </c:pt>
               </c:numCache>
@@ -9487,7 +9641,7 @@
         <c:scaling>
           <c:orientation val="minMax"/>
           <c:max val="2026"/>
-          <c:min val="2023"/>
+          <c:min val="2021.5"/>
         </c:scaling>
         <c:delete val="0"/>
         <c:axPos val="b"/>

</xml_diff>

<commit_message>
4.1: misollar uchta rasmga ajratildi (MKB, BRB, SQB milliy va MHXS)
Co-Authored-By: Claude Opus 5.5 <noreply@anthropic.com>
Claude-Session: https://claude.ai/code/session_01PxHTC8Q7yHdrpAeUA5KUgM
</commit_message>
<xml_diff>
--- a/paragraflar/4.1-paragraf.docx
+++ b/paragraflar/4.1-paragraf.docx
@@ -2,7 +2,7 @@
 <file path=word/document.xml><?xml version="1.0" encoding="utf-8"?>
 <w:document xmlns:w="http://schemas.openxmlformats.org/wordprocessingml/2006/main" xmlns:m="http://schemas.openxmlformats.org/officeDocument/2006/math" xmlns:r="http://schemas.openxmlformats.org/officeDocument/2006/relationships" xmlns:o="urn:schemas-microsoft-com:office:office" xmlns:v="urn:schemas-microsoft-com:vml" xmlns:w10="urn:schemas-microsoft-com:office:word" xmlns:a="http://schemas.openxmlformats.org/drawingml/2006/main" xmlns:pic="http://schemas.openxmlformats.org/drawingml/2006/picture" xmlns:wp="http://schemas.openxmlformats.org/drawingml/2006/wordprocessingDrawing">
   <w:body>
-    <w:bookmarkStart w:id="45" w:name="X1595b54503e12f06e30c058f5d96c2dde3d42ae"/>
+    <w:bookmarkStart w:id="47" w:name="X1595b54503e12f06e30c058f5d96c2dde3d42ae"/>
     <w:p>
       <w:pPr>
         <w:pStyle w:val="Heading2"/>
@@ -5357,7 +5357,7 @@
           <w:rFonts w:ascii="Times New Roman" w:hAnsi="Times New Roman" w:cs="Times New Roman" w:eastAsia="Times New Roman"/>
           <w:sz w:val="28"/>
         </w:rPr>
-        <w:t xml:space="preserve">Integral indeksning erta ogohlantirish signalini qanday berganini 2024-yilda eng yirik zarar ko‘rgan ikki bank misolida ko‘rib chiqish mumkin (4.1.3-rasm).</w:t>
+        <w:t xml:space="preserve">Integral indeksning erta ogohlantirish signalini qanday berganini 2024-yilda eng yirik zarar ko‘rgan ikki bank va tadqiqotning asosiy obyekti bo‘lgan «O‘zsanoatqurilishbank» ATB misolida ko‘rib chiqish mumkin. Dastlab «Mikrokreditbank» ATB ning integral indeksi dinamikasini ko‘rib chiqamiz (4.1.3-rasm).</w:t>
       </w:r>
     </w:p>
     <w:p>
@@ -5400,7 +5400,7 @@
           <w:b/>
           <w:sz w:val="28"/>
         </w:rPr>
-        <w:t xml:space="preserve">4.1.3-rasm. «Mikrokreditbank» ATB va «Biznesni rivojlantirish banki» ATB da integral indeks dinamikasi va erta ogohlantirish chegaralari, 2021–2025-yillar</w:t>
+        <w:t xml:space="preserve">4.1.3-rasm. «Mikrokreditbank» ATB da integral indeks dinamikasi va erta ogohlantirish chegaralari, 2021–2025-yillar</w:t>
       </w:r>
       <w:r>
         <w:rPr>
@@ -5421,7 +5421,56 @@
           <w:rFonts w:ascii="Times New Roman" w:hAnsi="Times New Roman" w:cs="Times New Roman" w:eastAsia="Times New Roman"/>
           <w:sz w:val="28"/>
         </w:rPr>
-        <w:t xml:space="preserve">Rasmdan ko‘rinib turibdiki, ikkala bankda ham integral indeks 2024-yil IV choragidagi yirik zararlardan ancha oldin qizil zonada bo‘lgan. «Mikrokreditbank» ATB ning indeksi 2021–2023-yillarda 2,65–2,82 ballni tashkil etib, deyarli barcha choraklarda 2,75 ballik chegaradan pastda bo‘lgan, 2024-yil II–III choraklarida esa 2,36–2,38 ballgacha keskin pasaygan, ya’ni zarar tan olinishidan ikki chorak oldin qo‘shimcha signal bergan. «Biznesni rivojlantirish banki» ATB ning indeksi 2022-yilda 2,67–2,93 ballni tashkil etgan bo‘lsa, 2023-yil III choragidagi 2,64 balldan 2023-yil IV choragida 2,44 ballgacha va 2024-yil I choragida 2,20 ballgacha pasaygan. Bu signal bankning 2024-yil I choragidagi 394,0 mlrd so‘mlik va IV choragidagi 1 952,0 mlrd so‘mlik zararlaridan oldin berilgan. Ikkala bankda ham zarar va qayta kapitallashtirishdan keyin indeks 2025-yilda oshgan, «Biznesni rivojlantirish banki» ATB da esa 3,15–3,28 ballgacha ko‘tarilib, yashil zona chegarasiga yetgan. Xuddi shunday signal «Garant bank» ATB da (2024-yil II–III choraklarida 2,55–2,57 ball), «Ipoteka-bank» ATB da (2024-yil III choragida 2,50 ball) va «Xalq banki» ATB da (2022-yilda 2,35–2,51 ball) ham kuzatilgan. Integral indeks o‘tkazib yuborgan yagona yirik hodisa «Tibisi bank» ATB ning 2022-yildagi zararlaridir: bank faoliyatining dastlabki bosqichida yuqori daromadlilik va kam muammoli kreditlar bilan indeksi 3,83 ballni tashkil etgan, zarar esa bank faoliyatining dastlabki bosqichidagi xarajatlar bilan bog‘liq bo‘lishi mumkin. Bu holat erta ogohlantirish tizimida integral indeks bilan bir qatorda kreditlar o‘sish sur’atini ham kuzatish lozimligini ko‘rsatadi.</w:t>
+        <w:t xml:space="preserve">Rasmdan ko‘rinib turibdiki, bankning integral indeksi 2024-yil IV choragidagi yirik zarardan ancha oldin qizil zonada bo‘lgan. Indeks 2021–2023-yillarda 2,65–2,82 ballni tashkil etib, deyarli barcha choraklarda 2,75 ballik chegaradan pastda bo‘lgan, 2024-yil II–III choraklarida esa 2,36–2,38 ballgacha keskin pasaygan, ya’ni zarar tan olinishidan ikki chorak oldin qo‘shimcha signal bergan. Bu signal bank kapitalining 43 foizini yo‘qotishiga olib kelgan 1 707,7 mlrd so‘mlik chorak zararidan oldin berilgan. Zarar va qayta kapitallashtirishdan keyin indeks 2025-yilda 2,90 ballgacha oshib, sariq zonaga o‘tgan. «Biznesni rivojlantirish banki» ATB da ham xuddi shunday manzara kuzatilgan (4.1.4-rasm).</w:t>
+      </w:r>
+    </w:p>
+    <w:p>
+      <w:pPr>
+        <w:pStyle w:val="BodyText"/>
+        <w:keepNext/>
+        <w:spacing w:line="240" w:lineRule="auto" w:before="0" w:after="0"/>
+        <w:ind w:firstLine="0"/>
+        <w:jc w:val="center"/>
+      </w:pPr>
+      <w:r xmlns:c="http://schemas.openxmlformats.org/drawingml/2006/chart">
+        <w:rPr>
+          <w:noProof/>
+        </w:rPr>
+        <w:drawing>
+          <wp:inline distT="0" distB="0" distL="0" distR="0">
+            <wp:extent cx="5760000" cy="2880000"/>
+            <wp:effectExtent l="0" t="0" r="0" b="0"/>
+            <wp:docPr id="1004" name="4.1.4-rasm"/>
+            <wp:cNvGraphicFramePr/>
+            <a:graphic>
+              <a:graphicData uri="http://schemas.openxmlformats.org/drawingml/2006/chart">
+                <c:chart r:id="rId12"/>
+              </a:graphicData>
+            </a:graphic>
+          </wp:inline>
+        </w:drawing>
+      </w:r>
+    </w:p>
+    <w:p>
+      <w:pPr>
+        <w:pStyle w:val="BodyText"/>
+        <w:spacing w:line="240" w:lineRule="auto" w:before="120" w:after="240"/>
+        <w:ind w:firstLine="0"/>
+        <w:jc w:val="center"/>
+      </w:pPr>
+      <w:r>
+        <w:rPr>
+          <w:rFonts w:ascii="Times New Roman" w:hAnsi="Times New Roman" w:cs="Times New Roman" w:eastAsia="Times New Roman"/>
+          <w:b/>
+          <w:sz w:val="28"/>
+        </w:rPr>
+        <w:t xml:space="preserve">4.1.4-rasm. «Biznesni rivojlantirish banki» ATB da integral indeks dinamikasi va erta ogohlantirish chegaralari, 2021–2025-yillar</w:t>
+      </w:r>
+      <w:r>
+        <w:rPr>
+          <w:rStyle w:val="FootnoteReference"/>
+        </w:rPr>
+        <w:footnoteReference w:id="44"/>
       </w:r>
     </w:p>
     <w:p>
@@ -5436,7 +5485,86 @@
           <w:rFonts w:ascii="Times New Roman" w:hAnsi="Times New Roman" w:cs="Times New Roman" w:eastAsia="Times New Roman"/>
           <w:sz w:val="28"/>
         </w:rPr>
-        <w:t xml:space="preserve">Erta ogohlantirish tizimining milliy va MHXS hisobotlari o‘rtasidagi tafovutga sezgirligini tadqiqotning asosiy obyekti bo‘lgan «O‘zsanoatqurilishbank» ATB misolida ko‘rish mumkin. Tahlil davrida bank muammo hodisasiga uchramagan, uning choraklik sof foydasi barcha choraklarda ijobiy bo‘lgan. Milliy hisobot ma’lumotlari asosidagi panel indeksi 2021–2025-yillarda 3,17–3,61 ball oralig‘ida bo‘lib, bank asosan yashil zonada, 2022-yil IV choragidan 2024-yil II choragigacha bo‘lgan davrda esa sariq zonaning yuqori qismida (3,17–3,32 ball) joylashgan. Bankning eng zaif tomoni likvidlik bloki bo‘lib, uning bali 1,51–2,33 ni tashkil etgan, chunki kreditlarning depozitlarga nisbati 2023-yil IV choragida 414 foizga yetgan, 2025-yil oxirida esa 206 foizgacha pasaygan. Biroq 3.2-paragrafda MHXS hisobotlari asosida hisoblangan indeks bankning 2021–2025-yillarda 2,75–2,93 ball bilan sariq zonada bo‘lganini, 2024-yilda esa qizil zona chegarasiga yetganini ko‘rsatadi. Farqning asosiy sababi 2.3-paragrafda aniqlangan holat bo‘lib, 2025-yil yakunida bankning MHXS 9 bo‘yicha 3-bosqich kreditlari ulushi milliy tasnifdagi muammoli kreditlar ulushidan qariyb uch barobar yuqori bo‘lgan. Demak, milliy hisobot ma’lumotlari asosida bank yashil zonada ko‘rinsa-da, xalqaro standartlar bo‘yicha u kuchaytirilgan monitoring talab qiladigan sariq zonada joylashgan. Bu misol erta ogohlantirish tizimida milliy ko‘rsatkichlarni yashirin kredit riski koeffitsiyenti bilan tuzatish yoki bevosita MHXS ma’lumotlaridan foydalanish zarurligini ko‘rsatadi.</w:t>
+        <w:t xml:space="preserve">Rasmdan ko‘rinib turibdiki, bankning integral indeksi 2022-yilda 2,67–2,93 ballni tashkil etgan bo‘lsa, 2023-yil III choragidagi 2,64 balldan 2023-yil IV choragida 2,44 ballgacha va 2024-yil I choragida 2,20 ballgacha pasaygan. Bu signal bankning 2024-yil I choragidagi 394,0 mlrd so‘mlik va IV choragidagi 1 952,0 mlrd so‘mlik zararlaridan oldin berilgan. Zarar va qayta kapitallashtirishdan keyin indeks 2025-yilda 3,15–3,28 ballgacha ko‘tarilib, yashil zona chegarasiga yetgan. Xuddi shunday signal «Garant bank» ATB da (2024-yil II–III choraklarida 2,55–2,57 ball), «Ipoteka-bank» ATB da (2024-yil III choragida 2,50 ball) va «Xalq banki» ATB da (2022-yilda 2,35–2,51 ball) ham kuzatilgan. Integral indeks o‘tkazib yuborgan yagona yirik hodisa «Tibisi bank» ATB ning 2022-yildagi zararlaridir: bank faoliyatining dastlabki bosqichida yuqori daromadlilik va kam muammoli kreditlar bilan uning indeksi 3,83 ballni tashkil etgan, zarar esa faoliyatning dastlabki bosqichidagi xarajatlar bilan bog‘liq bo‘lishi mumkin. Bu holat erta ogohlantirish tizimida integral indeks bilan bir qatorda kreditlar o‘sish sur’atini ham kuzatish lozimligini ko‘rsatadi.</w:t>
+      </w:r>
+    </w:p>
+    <w:p>
+      <w:pPr>
+        <w:pStyle w:val="BodyText"/>
+        <w:spacing w:line="360" w:lineRule="auto" w:before="0" w:after="0"/>
+        <w:ind w:firstLine="709"/>
+        <w:jc w:val="both"/>
+      </w:pPr>
+      <w:r>
+        <w:rPr>
+          <w:rFonts w:ascii="Times New Roman" w:hAnsi="Times New Roman" w:cs="Times New Roman" w:eastAsia="Times New Roman"/>
+          <w:sz w:val="28"/>
+        </w:rPr>
+        <w:t xml:space="preserve">Erta ogohlantirish tizimining milliy va MHXS hisobotlari o‘rtasidagi tafovutga sezgirligini «O‘zsanoatqurilishbank» ATB misolida ko‘rish mumkin. Tahlil davrida bank muammo hodisasiga uchramagan, uning choraklik sof foydasi barcha choraklarda ijobiy bo‘lgan. Bank uchun integral indeks ikki variantda – milliy hisobot asosidagi choraklik panel indeksi va 3.2-paragrafda MHXS hisobotlari asosida hisoblangan yillik indeks sifatida taqqoslandi (4.1.5-rasm).</w:t>
+      </w:r>
+    </w:p>
+    <w:p>
+      <w:pPr>
+        <w:pStyle w:val="BodyText"/>
+        <w:keepNext/>
+        <w:spacing w:line="240" w:lineRule="auto" w:before="0" w:after="0"/>
+        <w:ind w:firstLine="0"/>
+        <w:jc w:val="center"/>
+      </w:pPr>
+      <w:r xmlns:c="http://schemas.openxmlformats.org/drawingml/2006/chart">
+        <w:rPr>
+          <w:noProof/>
+        </w:rPr>
+        <w:drawing>
+          <wp:inline distT="0" distB="0" distL="0" distR="0">
+            <wp:extent cx="5760000" cy="2880000"/>
+            <wp:effectExtent l="0" t="0" r="0" b="0"/>
+            <wp:docPr id="1005" name="4.1.5-rasm"/>
+            <wp:cNvGraphicFramePr/>
+            <a:graphic>
+              <a:graphicData uri="http://schemas.openxmlformats.org/drawingml/2006/chart">
+                <c:chart r:id="rId13"/>
+              </a:graphicData>
+            </a:graphic>
+          </wp:inline>
+        </w:drawing>
+      </w:r>
+    </w:p>
+    <w:p>
+      <w:pPr>
+        <w:pStyle w:val="BodyText"/>
+        <w:spacing w:line="240" w:lineRule="auto" w:before="120" w:after="240"/>
+        <w:ind w:firstLine="0"/>
+        <w:jc w:val="center"/>
+      </w:pPr>
+      <w:r>
+        <w:rPr>
+          <w:rFonts w:ascii="Times New Roman" w:hAnsi="Times New Roman" w:cs="Times New Roman" w:eastAsia="Times New Roman"/>
+          <w:b/>
+          <w:sz w:val="28"/>
+        </w:rPr>
+        <w:t xml:space="preserve">4.1.5-rasm. «O‘zsanoatqurilishbank» ATB da milliy hisobot va MHXS hisoboti asosidagi integral indeks hamda erta ogohlantirish chegaralari, 2021–2025-yillar</w:t>
+      </w:r>
+      <w:r>
+        <w:rPr>
+          <w:rStyle w:val="FootnoteReference"/>
+        </w:rPr>
+        <w:footnoteReference w:id="45"/>
+      </w:r>
+    </w:p>
+    <w:p>
+      <w:pPr>
+        <w:pStyle w:val="BodyText"/>
+        <w:spacing w:line="360" w:lineRule="auto" w:before="0" w:after="0"/>
+        <w:ind w:firstLine="709"/>
+        <w:jc w:val="both"/>
+      </w:pPr>
+      <w:r>
+        <w:rPr>
+          <w:rFonts w:ascii="Times New Roman" w:hAnsi="Times New Roman" w:cs="Times New Roman" w:eastAsia="Times New Roman"/>
+          <w:sz w:val="28"/>
+        </w:rPr>
+        <w:t xml:space="preserve">Rasmdan ko‘rinib turibdiki, milliy hisobot ma’lumotlari asosidagi indeks 2021–2025-yillarda 3,17–3,61 ball oralig‘ida bo‘lib, bank asosan yashil zonada, 2022-yil IV choragidan 2024-yil II choragigacha bo‘lgan davrda esa sariq zonaning yuqori qismida (3,17–3,32 ball) joylashgan. Bankning eng zaif tomoni likvidlik bloki bo‘lib, uning bali 1,51–2,33 ni tashkil etgan, chunki kreditlarning depozitlarga nisbati 2023-yil IV choragida 414 foizga yetgan, 2025-yil oxirida esa 206 foizgacha pasaygan. MHXS hisobotlari asosidagi indeks esa butun davr mobaynida 2,75–2,93 ball bilan sariq zonada bo‘lgan, 2024-yilda esa qizil zona chegarasiga yetgan. Ikki variant o‘rtasidagi farq 0,4–0,6 ballni tashkil etib, uning asosiy sababi 2.3-paragrafda aniqlangan holat bo‘lib, 2025-yil yakunida bankning MHXS 9 bo‘yicha 3-bosqich kreditlari ulushi milliy tasnifdagi muammoli kreditlar ulushidan qariyb uch barobar yuqori bo‘lgan. Demak, milliy hisobot ma’lumotlari asosida bank yashil zonada ko‘rinsa-da, xalqaro standartlar bo‘yicha u kuchaytirilgan monitoring talab qiladigan sariq zonada joylashgan. Bu misol erta ogohlantirish tizimida milliy ko‘rsatkichlarni yashirin kredit riski koeffitsiyenti bilan tuzatish yoki bevosita MHXS ma’lumotlaridan foydalanish zarurligini ko‘rsatadi.</w:t>
       </w:r>
     </w:p>
     <w:p>
@@ -5492,7 +5620,7 @@
         <w:rPr>
           <w:rStyle w:val="FootnoteReference"/>
         </w:rPr>
-        <w:footnoteReference w:id="44"/>
+        <w:footnoteReference w:id="46"/>
       </w:r>
     </w:p>
     <w:tbl>
@@ -6079,7 +6207,7 @@
         <w:t xml:space="preserve">Shunday qilib, tahlil natijalari 3.1-paragrafda taklif etilgan integral indeksning tijorat banklarida moliyaviy muammolarni bir yil oldin yuqori aniqlik bilan bashorat qilishini ko‘rsatdi: uning AUC qiymati 0,86 ni, vaqtdan tashqari sinovda esa 0,95 ni tashkil etdi, an’anaviy Z-score esa O‘zbekiston sharoitida bashorat kuchiga ega emasligi aniqlandi. Indeks asosida taklif etilgan uch zonali erta ogohlantirish tizimi nazorat organiga bank muammolarini ular moliyaviy hisobotda zarar sifatida namoyon bo‘lishidan oldin aniqlash va choralarni zaiflik manbasiga qaratish imkonini beradi.</w:t>
       </w:r>
     </w:p>
-    <w:bookmarkEnd w:id="45"/>
+    <w:bookmarkEnd w:id="47"/>
     <w:sectPr>
       <w:pgMar w:left="1701" w:right="850" w:top="1134" w:bottom="1134"/>
     </w:sectPr>
@@ -6564,6 +6692,44 @@
     </w:p>
   </w:footnote>
   <w:footnote w:id="44">
+    <w:p>
+      <w:pPr>
+        <w:pStyle w:val="FootnoteText"/>
+      </w:pPr>
+      <w:r>
+        <w:rPr>
+          <w:rStyle w:val="FootnoteReference"/>
+        </w:rPr>
+        <w:footnoteRef/>
+      </w:r>
+      <w:r>
+        <w:t xml:space="preserve"> </w:t>
+      </w:r>
+      <w:r>
+        <w:t xml:space="preserve">Tadqiqot natijasida muallif tomonidan 4.1.2-jadvalda ko‘rsatilgan manbalar ma’lumotlari asosida hisoblandi.</w:t>
+      </w:r>
+    </w:p>
+  </w:footnote>
+  <w:footnote w:id="45">
+    <w:p>
+      <w:pPr>
+        <w:pStyle w:val="FootnoteText"/>
+      </w:pPr>
+      <w:r>
+        <w:rPr>
+          <w:rStyle w:val="FootnoteReference"/>
+        </w:rPr>
+        <w:footnoteRef/>
+      </w:r>
+      <w:r>
+        <w:t xml:space="preserve"> </w:t>
+      </w:r>
+      <w:r>
+        <w:t xml:space="preserve">Tadqiqot natijasida muallif tomonidan quyidagi manbalar ma’lumotlari asosida hisoblandi: O‘zbekiston Respublikasi Markaziy banki. Banklar statistikasi: tijorat banklarining asosiy ko‘rsatkichlari va muammoli kreditlari to‘g‘risidagi oylik ma’lumotlar, 2021-yil aprel – 2026-yil yanvar. – https://cbu.uz/uz/statistics/bankstats/; «SNS» reyting agentligi. O‘zbekiston tijorat banklarining asosiy ko‘rsatkichlari bazasi (Banks_2025_IV, Banks_2026_II): 36 bank, 2021-yil IV chorak – 2026-yil II chorak; Joint Stock Commercial Bank «Uzbek Industrial and Construction Bank» and its subsidiaries. Consolidated Financial Statements for the year ended 31 December 2025 and Independent Auditor’s Report. – Tashkent, 2026. – P. 2–3; Акционерный коммерческий банк «Узбекский промышленно-строительный банк» и его дочерние организации. Консолидированная финансовая отчетность и аудиторское заключение за годы, закончившиеся 31 декабря 2023, 2022 и 2021 гг. – Ташкент, 2024.</w:t>
+      </w:r>
+    </w:p>
+  </w:footnote>
+  <w:footnote w:id="46">
     <w:p>
       <w:pPr>
         <w:pStyle w:val="FootnoteText"/>
@@ -9060,9 +9226,1487 @@
           </c:marker>
           <c:dLbls>
             <c:dLbl>
+              <c:idx val="1"/>
+              <c:delete val="1"/>
+            </c:dLbl>
+            <c:dLbl>
+              <c:idx val="2"/>
+              <c:delete val="1"/>
+            </c:dLbl>
+            <c:dLbl>
+              <c:idx val="3"/>
+              <c:delete val="1"/>
+            </c:dLbl>
+            <c:dLbl>
+              <c:idx val="5"/>
+              <c:delete val="1"/>
+            </c:dLbl>
+            <c:dLbl>
+              <c:idx val="6"/>
+              <c:delete val="1"/>
+            </c:dLbl>
+            <c:dLbl>
+              <c:idx val="7"/>
+              <c:delete val="1"/>
+            </c:dLbl>
+            <c:dLbl>
+              <c:idx val="8"/>
+              <c:delete val="1"/>
+            </c:dLbl>
+            <c:dLbl>
+              <c:idx val="12"/>
+              <c:delete val="1"/>
+            </c:dLbl>
+            <c:dLbl>
+              <c:idx val="13"/>
+              <c:delete val="1"/>
+            </c:dLbl>
+            <c:dLbl>
+              <c:idx val="14"/>
+              <c:delete val="1"/>
+            </c:dLbl>
+            <c:spPr>
+              <a:noFill/>
+              <a:ln>
+                <a:noFill/>
+              </a:ln>
+            </c:spPr>
+            <c:txPr>
+              <a:bodyPr/>
+              <a:lstStyle/>
+              <a:p>
+                <a:pPr>
+                  <a:defRPr sz="1000" b="1">
+                    <a:solidFill>
+                      <a:srgbClr val="EB6834"/>
+                    </a:solidFill>
+                    <a:latin typeface="Times New Roman"/>
+                    <a:cs typeface="Times New Roman"/>
+                  </a:defRPr>
+                </a:pPr>
+                <a:endParaRPr lang="uz-Latn-UZ"/>
+              </a:p>
+            </c:txPr>
+            <c:dLblPos val="b"/>
+            <c:showLegendKey val="0"/>
+            <c:showVal val="1"/>
+            <c:showCatName val="0"/>
+            <c:showSerName val="0"/>
+            <c:showPercent val="0"/>
+            <c:showBubbleSize val="0"/>
+          </c:dLbls>
+          <c:xVal>
+            <c:numRef>
+              <c:f>Sheet1!$A$2:$A$18</c:f>
+              <c:numCache>
+                <c:formatCode>General</c:formatCode>
+                <c:ptCount val="17"/>
+                <c:pt idx="0">
+                  <c:v>2021.375</c:v>
+                </c:pt>
+                <c:pt idx="1">
+                  <c:v>2021.625</c:v>
+                </c:pt>
+                <c:pt idx="2">
+                  <c:v>2021.875</c:v>
+                </c:pt>
+                <c:pt idx="3">
+                  <c:v>2022.125</c:v>
+                </c:pt>
+                <c:pt idx="4">
+                  <c:v>2022.375</c:v>
+                </c:pt>
+                <c:pt idx="5">
+                  <c:v>2022.625</c:v>
+                </c:pt>
+                <c:pt idx="6">
+                  <c:v>2022.875</c:v>
+                </c:pt>
+                <c:pt idx="7">
+                  <c:v>2023.125</c:v>
+                </c:pt>
+                <c:pt idx="8">
+                  <c:v>2023.375</c:v>
+                </c:pt>
+                <c:pt idx="9">
+                  <c:v>2023.625</c:v>
+                </c:pt>
+                <c:pt idx="10">
+                  <c:v>2023.875</c:v>
+                </c:pt>
+                <c:pt idx="11">
+                  <c:v>2024.125</c:v>
+                </c:pt>
+                <c:pt idx="12">
+                  <c:v>2024.375</c:v>
+                </c:pt>
+                <c:pt idx="13">
+                  <c:v>2024.625</c:v>
+                </c:pt>
+                <c:pt idx="14">
+                  <c:v>2024.875</c:v>
+                </c:pt>
+                <c:pt idx="15">
+                  <c:v>2025.125</c:v>
+                </c:pt>
+                <c:pt idx="16">
+                  <c:v>2025.375</c:v>
+                </c:pt>
+              </c:numCache>
+            </c:numRef>
+          </c:xVal>
+          <c:yVal>
+            <c:numRef>
+              <c:f>Sheet1!$B$2:$B$18</c:f>
+              <c:numCache>
+                <c:formatCode>General</c:formatCode>
+                <c:ptCount val="17"/>
+                <c:pt idx="0">
+                  <c:v>2.75</c:v>
+                </c:pt>
+                <c:pt idx="1">
+                  <c:v>2.68</c:v>
+                </c:pt>
+                <c:pt idx="2">
+                  <c:v>2.71</c:v>
+                </c:pt>
+                <c:pt idx="3">
+                  <c:v>2.72</c:v>
+                </c:pt>
+                <c:pt idx="4">
+                  <c:v>2.82</c:v>
+                </c:pt>
+                <c:pt idx="5">
+                  <c:v>2.67</c:v>
+                </c:pt>
+                <c:pt idx="6">
+                  <c:v>2.65</c:v>
+                </c:pt>
+                <c:pt idx="7">
+                  <c:v>2.68</c:v>
+                </c:pt>
+                <c:pt idx="8">
+                  <c:v>2.69</c:v>
+                </c:pt>
+                <c:pt idx="9">
+                  <c:v>2.62</c:v>
+                </c:pt>
+                <c:pt idx="10">
+                  <c:v>2.36</c:v>
+                </c:pt>
+                <c:pt idx="11">
+                  <c:v>2.38</c:v>
+                </c:pt>
+                <c:pt idx="12">
+                  <c:v>2.71</c:v>
+                </c:pt>
+                <c:pt idx="13">
+                  <c:v>2.67</c:v>
+                </c:pt>
+                <c:pt idx="14">
+                  <c:v>2.69</c:v>
+                </c:pt>
+                <c:pt idx="15">
+                  <c:v>2.9</c:v>
+                </c:pt>
+                <c:pt idx="16">
+                  <c:v>2.9</c:v>
+                </c:pt>
+              </c:numCache>
+            </c:numRef>
+          </c:yVal>
+          <c:smooth val="0"/>
+        </c:ser>
+        <c:ser>
+          <c:idx val="1"/>
+          <c:order val="1"/>
+          <c:tx>
+            <c:strRef>
+              <c:f>Sheet1!$D$1</c:f>
+              <c:strCache>
+                <c:ptCount val="1"/>
+                <c:pt idx="0">
+                  <c:v>Qizil zona chegarasi (2,75)</c:v>
+                </c:pt>
+              </c:strCache>
+            </c:strRef>
+          </c:tx>
+          <c:spPr>
+            <a:ln w="15875">
+              <a:solidFill>
+                <a:srgbClr val="C00000"/>
+              </a:solidFill>
+              <a:prstDash val="dash"/>
+            </a:ln>
+          </c:spPr>
+          <c:marker>
+            <c:symbol val="none"/>
+          </c:marker>
+          <c:xVal>
+            <c:numRef>
+              <c:f>Sheet1!$C$2:$C$18</c:f>
+              <c:numCache>
+                <c:formatCode>General</c:formatCode>
+                <c:ptCount val="17"/>
+                <c:pt idx="0">
+                  <c:v>2021.375</c:v>
+                </c:pt>
+                <c:pt idx="1">
+                  <c:v>2021.625</c:v>
+                </c:pt>
+                <c:pt idx="2">
+                  <c:v>2021.875</c:v>
+                </c:pt>
+                <c:pt idx="3">
+                  <c:v>2022.125</c:v>
+                </c:pt>
+                <c:pt idx="4">
+                  <c:v>2022.375</c:v>
+                </c:pt>
+                <c:pt idx="5">
+                  <c:v>2022.625</c:v>
+                </c:pt>
+                <c:pt idx="6">
+                  <c:v>2022.875</c:v>
+                </c:pt>
+                <c:pt idx="7">
+                  <c:v>2023.125</c:v>
+                </c:pt>
+                <c:pt idx="8">
+                  <c:v>2023.375</c:v>
+                </c:pt>
+                <c:pt idx="9">
+                  <c:v>2023.625</c:v>
+                </c:pt>
+                <c:pt idx="10">
+                  <c:v>2023.875</c:v>
+                </c:pt>
+                <c:pt idx="11">
+                  <c:v>2024.125</c:v>
+                </c:pt>
+                <c:pt idx="12">
+                  <c:v>2024.375</c:v>
+                </c:pt>
+                <c:pt idx="13">
+                  <c:v>2024.625</c:v>
+                </c:pt>
+                <c:pt idx="14">
+                  <c:v>2024.875</c:v>
+                </c:pt>
+                <c:pt idx="15">
+                  <c:v>2025.125</c:v>
+                </c:pt>
+                <c:pt idx="16">
+                  <c:v>2025.375</c:v>
+                </c:pt>
+              </c:numCache>
+            </c:numRef>
+          </c:xVal>
+          <c:yVal>
+            <c:numRef>
+              <c:f>Sheet1!$D$2:$D$18</c:f>
+              <c:numCache>
+                <c:formatCode>General</c:formatCode>
+                <c:ptCount val="17"/>
+                <c:pt idx="0">
+                  <c:v>2.75</c:v>
+                </c:pt>
+                <c:pt idx="1">
+                  <c:v>2.75</c:v>
+                </c:pt>
+                <c:pt idx="2">
+                  <c:v>2.75</c:v>
+                </c:pt>
+                <c:pt idx="3">
+                  <c:v>2.75</c:v>
+                </c:pt>
+                <c:pt idx="4">
+                  <c:v>2.75</c:v>
+                </c:pt>
+                <c:pt idx="5">
+                  <c:v>2.75</c:v>
+                </c:pt>
+                <c:pt idx="6">
+                  <c:v>2.75</c:v>
+                </c:pt>
+                <c:pt idx="7">
+                  <c:v>2.75</c:v>
+                </c:pt>
+                <c:pt idx="8">
+                  <c:v>2.75</c:v>
+                </c:pt>
+                <c:pt idx="9">
+                  <c:v>2.75</c:v>
+                </c:pt>
+                <c:pt idx="10">
+                  <c:v>2.75</c:v>
+                </c:pt>
+                <c:pt idx="11">
+                  <c:v>2.75</c:v>
+                </c:pt>
+                <c:pt idx="12">
+                  <c:v>2.75</c:v>
+                </c:pt>
+                <c:pt idx="13">
+                  <c:v>2.75</c:v>
+                </c:pt>
+                <c:pt idx="14">
+                  <c:v>2.75</c:v>
+                </c:pt>
+                <c:pt idx="15">
+                  <c:v>2.75</c:v>
+                </c:pt>
+                <c:pt idx="16">
+                  <c:v>2.75</c:v>
+                </c:pt>
+              </c:numCache>
+            </c:numRef>
+          </c:yVal>
+          <c:smooth val="0"/>
+        </c:ser>
+        <c:ser>
+          <c:idx val="2"/>
+          <c:order val="2"/>
+          <c:tx>
+            <c:strRef>
+              <c:f>Sheet1!$F$1</c:f>
+              <c:strCache>
+                <c:ptCount val="1"/>
+                <c:pt idx="0">
+                  <c:v>Yashil zona chegarasi (3,25)</c:v>
+                </c:pt>
+              </c:strCache>
+            </c:strRef>
+          </c:tx>
+          <c:spPr>
+            <a:ln w="15875">
+              <a:solidFill>
+                <a:srgbClr val="70AD47"/>
+              </a:solidFill>
+              <a:prstDash val="dash"/>
+            </a:ln>
+          </c:spPr>
+          <c:marker>
+            <c:symbol val="none"/>
+          </c:marker>
+          <c:xVal>
+            <c:numRef>
+              <c:f>Sheet1!$E$2:$E$18</c:f>
+              <c:numCache>
+                <c:formatCode>General</c:formatCode>
+                <c:ptCount val="17"/>
+                <c:pt idx="0">
+                  <c:v>2021.375</c:v>
+                </c:pt>
+                <c:pt idx="1">
+                  <c:v>2021.625</c:v>
+                </c:pt>
+                <c:pt idx="2">
+                  <c:v>2021.875</c:v>
+                </c:pt>
+                <c:pt idx="3">
+                  <c:v>2022.125</c:v>
+                </c:pt>
+                <c:pt idx="4">
+                  <c:v>2022.375</c:v>
+                </c:pt>
+                <c:pt idx="5">
+                  <c:v>2022.625</c:v>
+                </c:pt>
+                <c:pt idx="6">
+                  <c:v>2022.875</c:v>
+                </c:pt>
+                <c:pt idx="7">
+                  <c:v>2023.125</c:v>
+                </c:pt>
+                <c:pt idx="8">
+                  <c:v>2023.375</c:v>
+                </c:pt>
+                <c:pt idx="9">
+                  <c:v>2023.625</c:v>
+                </c:pt>
+                <c:pt idx="10">
+                  <c:v>2023.875</c:v>
+                </c:pt>
+                <c:pt idx="11">
+                  <c:v>2024.125</c:v>
+                </c:pt>
+                <c:pt idx="12">
+                  <c:v>2024.375</c:v>
+                </c:pt>
+                <c:pt idx="13">
+                  <c:v>2024.625</c:v>
+                </c:pt>
+                <c:pt idx="14">
+                  <c:v>2024.875</c:v>
+                </c:pt>
+                <c:pt idx="15">
+                  <c:v>2025.125</c:v>
+                </c:pt>
+                <c:pt idx="16">
+                  <c:v>2025.375</c:v>
+                </c:pt>
+              </c:numCache>
+            </c:numRef>
+          </c:xVal>
+          <c:yVal>
+            <c:numRef>
+              <c:f>Sheet1!$F$2:$F$18</c:f>
+              <c:numCache>
+                <c:formatCode>General</c:formatCode>
+                <c:ptCount val="17"/>
+                <c:pt idx="0">
+                  <c:v>3.25</c:v>
+                </c:pt>
+                <c:pt idx="1">
+                  <c:v>3.25</c:v>
+                </c:pt>
+                <c:pt idx="2">
+                  <c:v>3.25</c:v>
+                </c:pt>
+                <c:pt idx="3">
+                  <c:v>3.25</c:v>
+                </c:pt>
+                <c:pt idx="4">
+                  <c:v>3.25</c:v>
+                </c:pt>
+                <c:pt idx="5">
+                  <c:v>3.25</c:v>
+                </c:pt>
+                <c:pt idx="6">
+                  <c:v>3.25</c:v>
+                </c:pt>
+                <c:pt idx="7">
+                  <c:v>3.25</c:v>
+                </c:pt>
+                <c:pt idx="8">
+                  <c:v>3.25</c:v>
+                </c:pt>
+                <c:pt idx="9">
+                  <c:v>3.25</c:v>
+                </c:pt>
+                <c:pt idx="10">
+                  <c:v>3.25</c:v>
+                </c:pt>
+                <c:pt idx="11">
+                  <c:v>3.25</c:v>
+                </c:pt>
+                <c:pt idx="12">
+                  <c:v>3.25</c:v>
+                </c:pt>
+                <c:pt idx="13">
+                  <c:v>3.25</c:v>
+                </c:pt>
+                <c:pt idx="14">
+                  <c:v>3.25</c:v>
+                </c:pt>
+                <c:pt idx="15">
+                  <c:v>3.25</c:v>
+                </c:pt>
+                <c:pt idx="16">
+                  <c:v>3.25</c:v>
+                </c:pt>
+              </c:numCache>
+            </c:numRef>
+          </c:yVal>
+          <c:smooth val="0"/>
+        </c:ser>
+        <c:axId val="333"/>
+        <c:axId val="444"/>
+      </c:scatterChart>
+      <c:valAx>
+        <c:axId val="333"/>
+        <c:scaling>
+          <c:orientation val="minMax"/>
+          <c:max val="2025.5"/>
+          <c:min val="2021"/>
+        </c:scaling>
+        <c:delete val="0"/>
+        <c:axPos val="b"/>
+        <c:title>
+          <c:tx>
+            <c:rich>
+              <a:bodyPr/>
+              <a:lstStyle/>
+              <a:p>
+                <a:pPr>
+                  <a:defRPr sz="1100" b="0">
+                    <a:solidFill>
+                      <a:srgbClr val="000000"/>
+                    </a:solidFill>
+                    <a:latin typeface="Times New Roman"/>
+                    <a:cs typeface="Times New Roman"/>
+                  </a:defRPr>
+                </a:pPr>
+                <a:r>
+                  <a:rPr lang="uz-Latn-UZ" sz="1100" b="0">
+                    <a:solidFill>
+                      <a:srgbClr val="000000"/>
+                    </a:solidFill>
+                    <a:latin typeface="Times New Roman"/>
+                  </a:rPr>
+                  <a:t>Yillar (choraklar)</a:t>
+                </a:r>
+              </a:p>
+            </c:rich>
+          </c:tx>
+          <c:overlay val="0"/>
+        </c:title>
+        <c:numFmt formatCode="0" sourceLinked="0"/>
+        <c:majorTickMark val="out"/>
+        <c:minorTickMark val="none"/>
+        <c:tickLblPos val="low"/>
+        <c:spPr>
+          <a:ln w="9525">
+            <a:solidFill>
+              <a:srgbClr val="595959"/>
+            </a:solidFill>
+          </a:ln>
+        </c:spPr>
+        <c:txPr>
+          <a:bodyPr rot="0" vert="horz"/>
+          <a:lstStyle/>
+          <a:p>
+            <a:pPr>
+              <a:defRPr sz="1100" b="0">
+                <a:solidFill>
+                  <a:srgbClr val="000000"/>
+                </a:solidFill>
+                <a:latin typeface="Times New Roman"/>
+                <a:cs typeface="Times New Roman"/>
+              </a:defRPr>
+            </a:pPr>
+            <a:endParaRPr lang="uz-Latn-UZ"/>
+          </a:p>
+        </c:txPr>
+        <c:crossAx val="444"/>
+        <c:crosses val="autoZero"/>
+        <c:crossBetween val="midCat"/>
+        <c:majorUnit val="1"/>
+      </c:valAx>
+      <c:valAx>
+        <c:axId val="444"/>
+        <c:scaling>
+          <c:orientation val="minMax"/>
+          <c:max val="4.0"/>
+          <c:min val="2.0"/>
+        </c:scaling>
+        <c:delete val="0"/>
+        <c:axPos val="l"/>
+        <c:majorGridlines>
+          <c:spPr>
+            <a:ln w="6350">
+              <a:solidFill>
+                <a:srgbClr val="D9D9D9"/>
+              </a:solidFill>
+            </a:ln>
+          </c:spPr>
+        </c:majorGridlines>
+        <c:title>
+          <c:tx>
+            <c:rich>
+              <a:bodyPr rot="-5400000" vert="horz"/>
+              <a:lstStyle/>
+              <a:p>
+                <a:pPr>
+                  <a:defRPr sz="1100" b="0">
+                    <a:solidFill>
+                      <a:srgbClr val="000000"/>
+                    </a:solidFill>
+                    <a:latin typeface="Times New Roman"/>
+                    <a:cs typeface="Times New Roman"/>
+                  </a:defRPr>
+                </a:pPr>
+                <a:r>
+                  <a:rPr lang="uz-Latn-UZ" sz="1100" b="0">
+                    <a:solidFill>
+                      <a:srgbClr val="000000"/>
+                    </a:solidFill>
+                    <a:latin typeface="Times New Roman"/>
+                  </a:rPr>
+                  <a:t>MBII, ball</a:t>
+                </a:r>
+              </a:p>
+            </c:rich>
+          </c:tx>
+          <c:overlay val="0"/>
+        </c:title>
+        <c:numFmt formatCode="0.00" sourceLinked="0"/>
+        <c:majorTickMark val="out"/>
+        <c:minorTickMark val="none"/>
+        <c:tickLblPos val="low"/>
+        <c:spPr>
+          <a:ln w="9525">
+            <a:solidFill>
+              <a:srgbClr val="595959"/>
+            </a:solidFill>
+          </a:ln>
+        </c:spPr>
+        <c:txPr>
+          <a:bodyPr/>
+          <a:lstStyle/>
+          <a:p>
+            <a:pPr>
+              <a:defRPr sz="1100" b="0">
+                <a:solidFill>
+                  <a:srgbClr val="000000"/>
+                </a:solidFill>
+                <a:latin typeface="Times New Roman"/>
+                <a:cs typeface="Times New Roman"/>
+              </a:defRPr>
+            </a:pPr>
+            <a:endParaRPr lang="uz-Latn-UZ"/>
+          </a:p>
+        </c:txPr>
+        <c:crossAx val="333"/>
+        <c:crosses val="autoZero"/>
+        <c:crossBetween val="midCat"/>
+        <c:majorUnit val="0.25"/>
+      </c:valAx>
+      <c:spPr>
+        <a:noFill/>
+        <a:ln>
+          <a:noFill/>
+        </a:ln>
+      </c:spPr>
+    </c:plotArea>
+    <c:legend>
+      <c:legendPos val="b"/>
+      <c:overlay val="0"/>
+      <c:txPr>
+        <a:bodyPr/>
+        <a:lstStyle/>
+        <a:p>
+          <a:pPr>
+            <a:defRPr sz="1050" b="0">
+              <a:solidFill>
+                <a:srgbClr val="000000"/>
+              </a:solidFill>
+              <a:latin typeface="Times New Roman"/>
+              <a:cs typeface="Times New Roman"/>
+            </a:defRPr>
+          </a:pPr>
+          <a:endParaRPr lang="uz-Latn-UZ"/>
+        </a:p>
+      </c:txPr>
+    </c:legend>
+    <c:plotVisOnly val="1"/>
+    <c:dispBlanksAs val="gap"/>
+  </c:chart>
+  <c:spPr>
+    <a:solidFill>
+      <a:srgbClr val="FFFFFF"/>
+    </a:solidFill>
+    <a:ln>
+      <a:noFill/>
+    </a:ln>
+  </c:spPr>
+  <c:txPr>
+    <a:bodyPr/>
+    <a:lstStyle/>
+    <a:p>
+      <a:pPr>
+        <a:defRPr sz="1100" b="0">
+          <a:solidFill>
+            <a:srgbClr val="000000"/>
+          </a:solidFill>
+          <a:latin typeface="Times New Roman"/>
+          <a:cs typeface="Times New Roman"/>
+        </a:defRPr>
+      </a:pPr>
+      <a:endParaRPr lang="uz-Latn-UZ"/>
+    </a:p>
+  </c:txPr>
+  <c:externalData r:id="rId1">
+    <c:autoUpdate val="0"/>
+  </c:externalData>
+</c:chartSpace>
+</file>
+
+<file path=word/charts/chart4.xml><?xml version="1.0" encoding="utf-8"?>
+<c:chartSpace xmlns:c="http://schemas.openxmlformats.org/drawingml/2006/chart" xmlns:a="http://schemas.openxmlformats.org/drawingml/2006/main" xmlns:r="http://schemas.openxmlformats.org/officeDocument/2006/relationships">
+  <c:date1904 val="0"/>
+  <c:lang val="uz-Latn-UZ"/>
+  <c:roundedCorners val="0"/>
+  <c:chart>
+    <c:autoTitleDeleted val="1"/>
+    <c:plotArea>
+      <c:layout/>
+      <c:scatterChart>
+        <c:scatterStyle val="lineMarker"/>
+        <c:varyColors val="0"/>
+        <c:ser>
+          <c:idx val="0"/>
+          <c:order val="0"/>
+          <c:tx>
+            <c:strRef>
+              <c:f>Sheet1!$B$1</c:f>
+              <c:strCache>
+                <c:ptCount val="1"/>
+                <c:pt idx="0">
+                  <c:v>«Biznesni rivojlantirish banki» ATB</c:v>
+                </c:pt>
+              </c:strCache>
+            </c:strRef>
+          </c:tx>
+          <c:spPr>
+            <a:ln w="28575">
+              <a:solidFill>
+                <a:srgbClr val="2A78D6"/>
+              </a:solidFill>
+            </a:ln>
+          </c:spPr>
+          <c:marker>
+            <c:symbol val="circle"/>
+            <c:size val="7"/>
+            <c:spPr>
+              <a:solidFill>
+                <a:srgbClr val="2A78D6"/>
+              </a:solidFill>
+              <a:ln>
+                <a:noFill/>
+              </a:ln>
+            </c:spPr>
+          </c:marker>
+          <c:dLbls>
+            <c:dLbl>
               <c:idx val="0"/>
               <c:delete val="1"/>
             </c:dLbl>
+            <c:dLbl>
+              <c:idx val="2"/>
+              <c:delete val="1"/>
+            </c:dLbl>
+            <c:dLbl>
+              <c:idx val="4"/>
+              <c:delete val="1"/>
+            </c:dLbl>
+            <c:dLbl>
+              <c:idx val="5"/>
+              <c:delete val="1"/>
+            </c:dLbl>
+            <c:dLbl>
+              <c:idx val="6"/>
+              <c:delete val="1"/>
+            </c:dLbl>
+            <c:dLbl>
+              <c:idx val="10"/>
+              <c:delete val="1"/>
+            </c:dLbl>
+            <c:dLbl>
+              <c:idx val="11"/>
+              <c:delete val="1"/>
+            </c:dLbl>
+            <c:dLbl>
+              <c:idx val="14"/>
+              <c:delete val="1"/>
+            </c:dLbl>
+            <c:dLbl>
+              <c:idx val="15"/>
+              <c:delete val="1"/>
+            </c:dLbl>
+            <c:dLbl>
+              <c:idx val="16"/>
+              <c:delete val="1"/>
+            </c:dLbl>
+            <c:spPr>
+              <a:noFill/>
+              <a:ln>
+                <a:noFill/>
+              </a:ln>
+            </c:spPr>
+            <c:txPr>
+              <a:bodyPr/>
+              <a:lstStyle/>
+              <a:p>
+                <a:pPr>
+                  <a:defRPr sz="1000" b="1">
+                    <a:solidFill>
+                      <a:srgbClr val="2A78D6"/>
+                    </a:solidFill>
+                    <a:latin typeface="Times New Roman"/>
+                    <a:cs typeface="Times New Roman"/>
+                  </a:defRPr>
+                </a:pPr>
+                <a:endParaRPr lang="uz-Latn-UZ"/>
+              </a:p>
+            </c:txPr>
+            <c:dLblPos val="b"/>
+            <c:showLegendKey val="0"/>
+            <c:showVal val="1"/>
+            <c:showCatName val="0"/>
+            <c:showSerName val="0"/>
+            <c:showPercent val="0"/>
+            <c:showBubbleSize val="0"/>
+          </c:dLbls>
+          <c:xVal>
+            <c:numRef>
+              <c:f>Sheet1!$A$2:$A$18</c:f>
+              <c:numCache>
+                <c:formatCode>General</c:formatCode>
+                <c:ptCount val="17"/>
+                <c:pt idx="0">
+                  <c:v>2021.375</c:v>
+                </c:pt>
+                <c:pt idx="1">
+                  <c:v>2021.625</c:v>
+                </c:pt>
+                <c:pt idx="2">
+                  <c:v>2021.875</c:v>
+                </c:pt>
+                <c:pt idx="3">
+                  <c:v>2022.125</c:v>
+                </c:pt>
+                <c:pt idx="4">
+                  <c:v>2022.375</c:v>
+                </c:pt>
+                <c:pt idx="5">
+                  <c:v>2022.625</c:v>
+                </c:pt>
+                <c:pt idx="6">
+                  <c:v>2022.875</c:v>
+                </c:pt>
+                <c:pt idx="7">
+                  <c:v>2023.125</c:v>
+                </c:pt>
+                <c:pt idx="8">
+                  <c:v>2023.375</c:v>
+                </c:pt>
+                <c:pt idx="9">
+                  <c:v>2023.625</c:v>
+                </c:pt>
+                <c:pt idx="10">
+                  <c:v>2023.875</c:v>
+                </c:pt>
+                <c:pt idx="11">
+                  <c:v>2024.125</c:v>
+                </c:pt>
+                <c:pt idx="12">
+                  <c:v>2024.375</c:v>
+                </c:pt>
+                <c:pt idx="13">
+                  <c:v>2024.625</c:v>
+                </c:pt>
+                <c:pt idx="14">
+                  <c:v>2024.875</c:v>
+                </c:pt>
+                <c:pt idx="15">
+                  <c:v>2025.125</c:v>
+                </c:pt>
+                <c:pt idx="16">
+                  <c:v>2025.375</c:v>
+                </c:pt>
+              </c:numCache>
+            </c:numRef>
+          </c:xVal>
+          <c:yVal>
+            <c:numRef>
+              <c:f>Sheet1!$B$2:$B$18</c:f>
+              <c:numCache>
+                <c:formatCode>General</c:formatCode>
+                <c:ptCount val="17"/>
+                <c:pt idx="1">
+                  <c:v>2.67</c:v>
+                </c:pt>
+                <c:pt idx="2">
+                  <c:v>2.71</c:v>
+                </c:pt>
+                <c:pt idx="3">
+                  <c:v>2.93</c:v>
+                </c:pt>
+                <c:pt idx="5">
+                  <c:v>2.85</c:v>
+                </c:pt>
+                <c:pt idx="6">
+                  <c:v>2.65</c:v>
+                </c:pt>
+                <c:pt idx="7">
+                  <c:v>2.64</c:v>
+                </c:pt>
+                <c:pt idx="8">
+                  <c:v>2.44</c:v>
+                </c:pt>
+                <c:pt idx="9">
+                  <c:v>2.2</c:v>
+                </c:pt>
+                <c:pt idx="10">
+                  <c:v>2.3</c:v>
+                </c:pt>
+                <c:pt idx="11">
+                  <c:v>2.45</c:v>
+                </c:pt>
+                <c:pt idx="12">
+                  <c:v>2.83</c:v>
+                </c:pt>
+                <c:pt idx="13">
+                  <c:v>3.18</c:v>
+                </c:pt>
+                <c:pt idx="14">
+                  <c:v>3.28</c:v>
+                </c:pt>
+                <c:pt idx="15">
+                  <c:v>3.22</c:v>
+                </c:pt>
+                <c:pt idx="16">
+                  <c:v>3.15</c:v>
+                </c:pt>
+              </c:numCache>
+            </c:numRef>
+          </c:yVal>
+          <c:smooth val="0"/>
+        </c:ser>
+        <c:ser>
+          <c:idx val="1"/>
+          <c:order val="1"/>
+          <c:tx>
+            <c:strRef>
+              <c:f>Sheet1!$D$1</c:f>
+              <c:strCache>
+                <c:ptCount val="1"/>
+                <c:pt idx="0">
+                  <c:v>Qizil zona chegarasi (2,75)</c:v>
+                </c:pt>
+              </c:strCache>
+            </c:strRef>
+          </c:tx>
+          <c:spPr>
+            <a:ln w="15875">
+              <a:solidFill>
+                <a:srgbClr val="C00000"/>
+              </a:solidFill>
+              <a:prstDash val="dash"/>
+            </a:ln>
+          </c:spPr>
+          <c:marker>
+            <c:symbol val="none"/>
+          </c:marker>
+          <c:xVal>
+            <c:numRef>
+              <c:f>Sheet1!$C$2:$C$18</c:f>
+              <c:numCache>
+                <c:formatCode>General</c:formatCode>
+                <c:ptCount val="17"/>
+                <c:pt idx="0">
+                  <c:v>2021.375</c:v>
+                </c:pt>
+                <c:pt idx="1">
+                  <c:v>2021.625</c:v>
+                </c:pt>
+                <c:pt idx="2">
+                  <c:v>2021.875</c:v>
+                </c:pt>
+                <c:pt idx="3">
+                  <c:v>2022.125</c:v>
+                </c:pt>
+                <c:pt idx="4">
+                  <c:v>2022.375</c:v>
+                </c:pt>
+                <c:pt idx="5">
+                  <c:v>2022.625</c:v>
+                </c:pt>
+                <c:pt idx="6">
+                  <c:v>2022.875</c:v>
+                </c:pt>
+                <c:pt idx="7">
+                  <c:v>2023.125</c:v>
+                </c:pt>
+                <c:pt idx="8">
+                  <c:v>2023.375</c:v>
+                </c:pt>
+                <c:pt idx="9">
+                  <c:v>2023.625</c:v>
+                </c:pt>
+                <c:pt idx="10">
+                  <c:v>2023.875</c:v>
+                </c:pt>
+                <c:pt idx="11">
+                  <c:v>2024.125</c:v>
+                </c:pt>
+                <c:pt idx="12">
+                  <c:v>2024.375</c:v>
+                </c:pt>
+                <c:pt idx="13">
+                  <c:v>2024.625</c:v>
+                </c:pt>
+                <c:pt idx="14">
+                  <c:v>2024.875</c:v>
+                </c:pt>
+                <c:pt idx="15">
+                  <c:v>2025.125</c:v>
+                </c:pt>
+                <c:pt idx="16">
+                  <c:v>2025.375</c:v>
+                </c:pt>
+              </c:numCache>
+            </c:numRef>
+          </c:xVal>
+          <c:yVal>
+            <c:numRef>
+              <c:f>Sheet1!$D$2:$D$18</c:f>
+              <c:numCache>
+                <c:formatCode>General</c:formatCode>
+                <c:ptCount val="17"/>
+                <c:pt idx="0">
+                  <c:v>2.75</c:v>
+                </c:pt>
+                <c:pt idx="1">
+                  <c:v>2.75</c:v>
+                </c:pt>
+                <c:pt idx="2">
+                  <c:v>2.75</c:v>
+                </c:pt>
+                <c:pt idx="3">
+                  <c:v>2.75</c:v>
+                </c:pt>
+                <c:pt idx="4">
+                  <c:v>2.75</c:v>
+                </c:pt>
+                <c:pt idx="5">
+                  <c:v>2.75</c:v>
+                </c:pt>
+                <c:pt idx="6">
+                  <c:v>2.75</c:v>
+                </c:pt>
+                <c:pt idx="7">
+                  <c:v>2.75</c:v>
+                </c:pt>
+                <c:pt idx="8">
+                  <c:v>2.75</c:v>
+                </c:pt>
+                <c:pt idx="9">
+                  <c:v>2.75</c:v>
+                </c:pt>
+                <c:pt idx="10">
+                  <c:v>2.75</c:v>
+                </c:pt>
+                <c:pt idx="11">
+                  <c:v>2.75</c:v>
+                </c:pt>
+                <c:pt idx="12">
+                  <c:v>2.75</c:v>
+                </c:pt>
+                <c:pt idx="13">
+                  <c:v>2.75</c:v>
+                </c:pt>
+                <c:pt idx="14">
+                  <c:v>2.75</c:v>
+                </c:pt>
+                <c:pt idx="15">
+                  <c:v>2.75</c:v>
+                </c:pt>
+                <c:pt idx="16">
+                  <c:v>2.75</c:v>
+                </c:pt>
+              </c:numCache>
+            </c:numRef>
+          </c:yVal>
+          <c:smooth val="0"/>
+        </c:ser>
+        <c:ser>
+          <c:idx val="2"/>
+          <c:order val="2"/>
+          <c:tx>
+            <c:strRef>
+              <c:f>Sheet1!$F$1</c:f>
+              <c:strCache>
+                <c:ptCount val="1"/>
+                <c:pt idx="0">
+                  <c:v>Yashil zona chegarasi (3,25)</c:v>
+                </c:pt>
+              </c:strCache>
+            </c:strRef>
+          </c:tx>
+          <c:spPr>
+            <a:ln w="15875">
+              <a:solidFill>
+                <a:srgbClr val="70AD47"/>
+              </a:solidFill>
+              <a:prstDash val="dash"/>
+            </a:ln>
+          </c:spPr>
+          <c:marker>
+            <c:symbol val="none"/>
+          </c:marker>
+          <c:xVal>
+            <c:numRef>
+              <c:f>Sheet1!$E$2:$E$18</c:f>
+              <c:numCache>
+                <c:formatCode>General</c:formatCode>
+                <c:ptCount val="17"/>
+                <c:pt idx="0">
+                  <c:v>2021.375</c:v>
+                </c:pt>
+                <c:pt idx="1">
+                  <c:v>2021.625</c:v>
+                </c:pt>
+                <c:pt idx="2">
+                  <c:v>2021.875</c:v>
+                </c:pt>
+                <c:pt idx="3">
+                  <c:v>2022.125</c:v>
+                </c:pt>
+                <c:pt idx="4">
+                  <c:v>2022.375</c:v>
+                </c:pt>
+                <c:pt idx="5">
+                  <c:v>2022.625</c:v>
+                </c:pt>
+                <c:pt idx="6">
+                  <c:v>2022.875</c:v>
+                </c:pt>
+                <c:pt idx="7">
+                  <c:v>2023.125</c:v>
+                </c:pt>
+                <c:pt idx="8">
+                  <c:v>2023.375</c:v>
+                </c:pt>
+                <c:pt idx="9">
+                  <c:v>2023.625</c:v>
+                </c:pt>
+                <c:pt idx="10">
+                  <c:v>2023.875</c:v>
+                </c:pt>
+                <c:pt idx="11">
+                  <c:v>2024.125</c:v>
+                </c:pt>
+                <c:pt idx="12">
+                  <c:v>2024.375</c:v>
+                </c:pt>
+                <c:pt idx="13">
+                  <c:v>2024.625</c:v>
+                </c:pt>
+                <c:pt idx="14">
+                  <c:v>2024.875</c:v>
+                </c:pt>
+                <c:pt idx="15">
+                  <c:v>2025.125</c:v>
+                </c:pt>
+                <c:pt idx="16">
+                  <c:v>2025.375</c:v>
+                </c:pt>
+              </c:numCache>
+            </c:numRef>
+          </c:xVal>
+          <c:yVal>
+            <c:numRef>
+              <c:f>Sheet1!$F$2:$F$18</c:f>
+              <c:numCache>
+                <c:formatCode>General</c:formatCode>
+                <c:ptCount val="17"/>
+                <c:pt idx="0">
+                  <c:v>3.25</c:v>
+                </c:pt>
+                <c:pt idx="1">
+                  <c:v>3.25</c:v>
+                </c:pt>
+                <c:pt idx="2">
+                  <c:v>3.25</c:v>
+                </c:pt>
+                <c:pt idx="3">
+                  <c:v>3.25</c:v>
+                </c:pt>
+                <c:pt idx="4">
+                  <c:v>3.25</c:v>
+                </c:pt>
+                <c:pt idx="5">
+                  <c:v>3.25</c:v>
+                </c:pt>
+                <c:pt idx="6">
+                  <c:v>3.25</c:v>
+                </c:pt>
+                <c:pt idx="7">
+                  <c:v>3.25</c:v>
+                </c:pt>
+                <c:pt idx="8">
+                  <c:v>3.25</c:v>
+                </c:pt>
+                <c:pt idx="9">
+                  <c:v>3.25</c:v>
+                </c:pt>
+                <c:pt idx="10">
+                  <c:v>3.25</c:v>
+                </c:pt>
+                <c:pt idx="11">
+                  <c:v>3.25</c:v>
+                </c:pt>
+                <c:pt idx="12">
+                  <c:v>3.25</c:v>
+                </c:pt>
+                <c:pt idx="13">
+                  <c:v>3.25</c:v>
+                </c:pt>
+                <c:pt idx="14">
+                  <c:v>3.25</c:v>
+                </c:pt>
+                <c:pt idx="15">
+                  <c:v>3.25</c:v>
+                </c:pt>
+                <c:pt idx="16">
+                  <c:v>3.25</c:v>
+                </c:pt>
+              </c:numCache>
+            </c:numRef>
+          </c:yVal>
+          <c:smooth val="0"/>
+        </c:ser>
+        <c:axId val="333"/>
+        <c:axId val="444"/>
+      </c:scatterChart>
+      <c:valAx>
+        <c:axId val="333"/>
+        <c:scaling>
+          <c:orientation val="minMax"/>
+          <c:max val="2025.5"/>
+          <c:min val="2021"/>
+        </c:scaling>
+        <c:delete val="0"/>
+        <c:axPos val="b"/>
+        <c:title>
+          <c:tx>
+            <c:rich>
+              <a:bodyPr/>
+              <a:lstStyle/>
+              <a:p>
+                <a:pPr>
+                  <a:defRPr sz="1100" b="0">
+                    <a:solidFill>
+                      <a:srgbClr val="000000"/>
+                    </a:solidFill>
+                    <a:latin typeface="Times New Roman"/>
+                    <a:cs typeface="Times New Roman"/>
+                  </a:defRPr>
+                </a:pPr>
+                <a:r>
+                  <a:rPr lang="uz-Latn-UZ" sz="1100" b="0">
+                    <a:solidFill>
+                      <a:srgbClr val="000000"/>
+                    </a:solidFill>
+                    <a:latin typeface="Times New Roman"/>
+                  </a:rPr>
+                  <a:t>Yillar (choraklar)</a:t>
+                </a:r>
+              </a:p>
+            </c:rich>
+          </c:tx>
+          <c:overlay val="0"/>
+        </c:title>
+        <c:numFmt formatCode="0" sourceLinked="0"/>
+        <c:majorTickMark val="out"/>
+        <c:minorTickMark val="none"/>
+        <c:tickLblPos val="low"/>
+        <c:spPr>
+          <a:ln w="9525">
+            <a:solidFill>
+              <a:srgbClr val="595959"/>
+            </a:solidFill>
+          </a:ln>
+        </c:spPr>
+        <c:txPr>
+          <a:bodyPr rot="0" vert="horz"/>
+          <a:lstStyle/>
+          <a:p>
+            <a:pPr>
+              <a:defRPr sz="1100" b="0">
+                <a:solidFill>
+                  <a:srgbClr val="000000"/>
+                </a:solidFill>
+                <a:latin typeface="Times New Roman"/>
+                <a:cs typeface="Times New Roman"/>
+              </a:defRPr>
+            </a:pPr>
+            <a:endParaRPr lang="uz-Latn-UZ"/>
+          </a:p>
+        </c:txPr>
+        <c:crossAx val="444"/>
+        <c:crosses val="autoZero"/>
+        <c:crossBetween val="midCat"/>
+        <c:majorUnit val="1"/>
+      </c:valAx>
+      <c:valAx>
+        <c:axId val="444"/>
+        <c:scaling>
+          <c:orientation val="minMax"/>
+          <c:max val="4.0"/>
+          <c:min val="2.0"/>
+        </c:scaling>
+        <c:delete val="0"/>
+        <c:axPos val="l"/>
+        <c:majorGridlines>
+          <c:spPr>
+            <a:ln w="6350">
+              <a:solidFill>
+                <a:srgbClr val="D9D9D9"/>
+              </a:solidFill>
+            </a:ln>
+          </c:spPr>
+        </c:majorGridlines>
+        <c:title>
+          <c:tx>
+            <c:rich>
+              <a:bodyPr rot="-5400000" vert="horz"/>
+              <a:lstStyle/>
+              <a:p>
+                <a:pPr>
+                  <a:defRPr sz="1100" b="0">
+                    <a:solidFill>
+                      <a:srgbClr val="000000"/>
+                    </a:solidFill>
+                    <a:latin typeface="Times New Roman"/>
+                    <a:cs typeface="Times New Roman"/>
+                  </a:defRPr>
+                </a:pPr>
+                <a:r>
+                  <a:rPr lang="uz-Latn-UZ" sz="1100" b="0">
+                    <a:solidFill>
+                      <a:srgbClr val="000000"/>
+                    </a:solidFill>
+                    <a:latin typeface="Times New Roman"/>
+                  </a:rPr>
+                  <a:t>MBII, ball</a:t>
+                </a:r>
+              </a:p>
+            </c:rich>
+          </c:tx>
+          <c:overlay val="0"/>
+        </c:title>
+        <c:numFmt formatCode="0.00" sourceLinked="0"/>
+        <c:majorTickMark val="out"/>
+        <c:minorTickMark val="none"/>
+        <c:tickLblPos val="low"/>
+        <c:spPr>
+          <a:ln w="9525">
+            <a:solidFill>
+              <a:srgbClr val="595959"/>
+            </a:solidFill>
+          </a:ln>
+        </c:spPr>
+        <c:txPr>
+          <a:bodyPr/>
+          <a:lstStyle/>
+          <a:p>
+            <a:pPr>
+              <a:defRPr sz="1100" b="0">
+                <a:solidFill>
+                  <a:srgbClr val="000000"/>
+                </a:solidFill>
+                <a:latin typeface="Times New Roman"/>
+                <a:cs typeface="Times New Roman"/>
+              </a:defRPr>
+            </a:pPr>
+            <a:endParaRPr lang="uz-Latn-UZ"/>
+          </a:p>
+        </c:txPr>
+        <c:crossAx val="333"/>
+        <c:crosses val="autoZero"/>
+        <c:crossBetween val="midCat"/>
+        <c:majorUnit val="0.25"/>
+      </c:valAx>
+      <c:spPr>
+        <a:noFill/>
+        <a:ln>
+          <a:noFill/>
+        </a:ln>
+      </c:spPr>
+    </c:plotArea>
+    <c:legend>
+      <c:legendPos val="b"/>
+      <c:overlay val="0"/>
+      <c:txPr>
+        <a:bodyPr/>
+        <a:lstStyle/>
+        <a:p>
+          <a:pPr>
+            <a:defRPr sz="1050" b="0">
+              <a:solidFill>
+                <a:srgbClr val="000000"/>
+              </a:solidFill>
+              <a:latin typeface="Times New Roman"/>
+              <a:cs typeface="Times New Roman"/>
+            </a:defRPr>
+          </a:pPr>
+          <a:endParaRPr lang="uz-Latn-UZ"/>
+        </a:p>
+      </c:txPr>
+    </c:legend>
+    <c:plotVisOnly val="1"/>
+    <c:dispBlanksAs val="gap"/>
+  </c:chart>
+  <c:spPr>
+    <a:solidFill>
+      <a:srgbClr val="FFFFFF"/>
+    </a:solidFill>
+    <a:ln>
+      <a:noFill/>
+    </a:ln>
+  </c:spPr>
+  <c:txPr>
+    <a:bodyPr/>
+    <a:lstStyle/>
+    <a:p>
+      <a:pPr>
+        <a:defRPr sz="1100" b="0">
+          <a:solidFill>
+            <a:srgbClr val="000000"/>
+          </a:solidFill>
+          <a:latin typeface="Times New Roman"/>
+          <a:cs typeface="Times New Roman"/>
+        </a:defRPr>
+      </a:pPr>
+      <a:endParaRPr lang="uz-Latn-UZ"/>
+    </a:p>
+  </c:txPr>
+  <c:externalData r:id="rId1">
+    <c:autoUpdate val="0"/>
+  </c:externalData>
+</c:chartSpace>
+</file>
+
+<file path=word/charts/chart5.xml><?xml version="1.0" encoding="utf-8"?>
+<c:chartSpace xmlns:c="http://schemas.openxmlformats.org/drawingml/2006/chart" xmlns:a="http://schemas.openxmlformats.org/drawingml/2006/main" xmlns:r="http://schemas.openxmlformats.org/officeDocument/2006/relationships">
+  <c:date1904 val="0"/>
+  <c:lang val="uz-Latn-UZ"/>
+  <c:roundedCorners val="0"/>
+  <c:chart>
+    <c:autoTitleDeleted val="1"/>
+    <c:plotArea>
+      <c:layout/>
+      <c:scatterChart>
+        <c:scatterStyle val="lineMarker"/>
+        <c:varyColors val="0"/>
+        <c:ser>
+          <c:idx val="0"/>
+          <c:order val="0"/>
+          <c:tx>
+            <c:strRef>
+              <c:f>Sheet1!$B$1</c:f>
+              <c:strCache>
+                <c:ptCount val="1"/>
+                <c:pt idx="0">
+                  <c:v>SQB: milliy hisobot asosida (choraklik)</c:v>
+                </c:pt>
+              </c:strCache>
+            </c:strRef>
+          </c:tx>
+          <c:spPr>
+            <a:ln w="28575">
+              <a:solidFill>
+                <a:srgbClr val="2A78D6"/>
+              </a:solidFill>
+            </a:ln>
+          </c:spPr>
+          <c:marker>
+            <c:symbol val="circle"/>
+            <c:size val="7"/>
+            <c:spPr>
+              <a:solidFill>
+                <a:srgbClr val="2A78D6"/>
+              </a:solidFill>
+              <a:ln>
+                <a:noFill/>
+              </a:ln>
+            </c:spPr>
+          </c:marker>
+          <c:dLbls>
             <c:dLbl>
               <c:idx val="1"/>
               <c:delete val="1"/>
@@ -9079,6 +10723,228 @@
               <c:idx val="4"/>
               <c:delete val="1"/>
             </c:dLbl>
+            <c:dLbl>
+              <c:idx val="5"/>
+              <c:delete val="1"/>
+            </c:dLbl>
+            <c:dLbl>
+              <c:idx val="7"/>
+              <c:delete val="1"/>
+            </c:dLbl>
+            <c:dLbl>
+              <c:idx val="8"/>
+              <c:delete val="1"/>
+            </c:dLbl>
+            <c:dLbl>
+              <c:idx val="9"/>
+              <c:delete val="1"/>
+            </c:dLbl>
+            <c:dLbl>
+              <c:idx val="11"/>
+              <c:delete val="1"/>
+            </c:dLbl>
+            <c:dLbl>
+              <c:idx val="12"/>
+              <c:delete val="1"/>
+            </c:dLbl>
+            <c:dLbl>
+              <c:idx val="13"/>
+              <c:delete val="1"/>
+            </c:dLbl>
+            <c:dLbl>
+              <c:idx val="14"/>
+              <c:delete val="1"/>
+            </c:dLbl>
+            <c:dLbl>
+              <c:idx val="15"/>
+              <c:delete val="1"/>
+            </c:dLbl>
+            <c:spPr>
+              <a:noFill/>
+              <a:ln>
+                <a:noFill/>
+              </a:ln>
+            </c:spPr>
+            <c:txPr>
+              <a:bodyPr/>
+              <a:lstStyle/>
+              <a:p>
+                <a:pPr>
+                  <a:defRPr sz="1000" b="1">
+                    <a:solidFill>
+                      <a:srgbClr val="2A78D6"/>
+                    </a:solidFill>
+                    <a:latin typeface="Times New Roman"/>
+                    <a:cs typeface="Times New Roman"/>
+                  </a:defRPr>
+                </a:pPr>
+                <a:endParaRPr lang="uz-Latn-UZ"/>
+              </a:p>
+            </c:txPr>
+            <c:dLblPos val="b"/>
+            <c:showLegendKey val="0"/>
+            <c:showVal val="1"/>
+            <c:showCatName val="0"/>
+            <c:showSerName val="0"/>
+            <c:showPercent val="0"/>
+            <c:showBubbleSize val="0"/>
+          </c:dLbls>
+          <c:xVal>
+            <c:numRef>
+              <c:f>Sheet1!$A$2:$A$18</c:f>
+              <c:numCache>
+                <c:formatCode>General</c:formatCode>
+                <c:ptCount val="17"/>
+                <c:pt idx="0">
+                  <c:v>2021.375</c:v>
+                </c:pt>
+                <c:pt idx="1">
+                  <c:v>2021.625</c:v>
+                </c:pt>
+                <c:pt idx="2">
+                  <c:v>2021.875</c:v>
+                </c:pt>
+                <c:pt idx="3">
+                  <c:v>2022.125</c:v>
+                </c:pt>
+                <c:pt idx="4">
+                  <c:v>2022.375</c:v>
+                </c:pt>
+                <c:pt idx="5">
+                  <c:v>2022.625</c:v>
+                </c:pt>
+                <c:pt idx="6">
+                  <c:v>2022.875</c:v>
+                </c:pt>
+                <c:pt idx="7">
+                  <c:v>2023.125</c:v>
+                </c:pt>
+                <c:pt idx="8">
+                  <c:v>2023.375</c:v>
+                </c:pt>
+                <c:pt idx="9">
+                  <c:v>2023.625</c:v>
+                </c:pt>
+                <c:pt idx="10">
+                  <c:v>2023.875</c:v>
+                </c:pt>
+                <c:pt idx="11">
+                  <c:v>2024.125</c:v>
+                </c:pt>
+                <c:pt idx="12">
+                  <c:v>2024.375</c:v>
+                </c:pt>
+                <c:pt idx="13">
+                  <c:v>2024.625</c:v>
+                </c:pt>
+                <c:pt idx="14">
+                  <c:v>2024.875</c:v>
+                </c:pt>
+                <c:pt idx="15">
+                  <c:v>2025.125</c:v>
+                </c:pt>
+                <c:pt idx="16">
+                  <c:v>2025.375</c:v>
+                </c:pt>
+              </c:numCache>
+            </c:numRef>
+          </c:xVal>
+          <c:yVal>
+            <c:numRef>
+              <c:f>Sheet1!$B$2:$B$18</c:f>
+              <c:numCache>
+                <c:formatCode>General</c:formatCode>
+                <c:ptCount val="17"/>
+                <c:pt idx="0">
+                  <c:v>3.39</c:v>
+                </c:pt>
+                <c:pt idx="1">
+                  <c:v>3.38</c:v>
+                </c:pt>
+                <c:pt idx="2">
+                  <c:v>3.38</c:v>
+                </c:pt>
+                <c:pt idx="3">
+                  <c:v>3.36</c:v>
+                </c:pt>
+                <c:pt idx="4">
+                  <c:v>3.27</c:v>
+                </c:pt>
+                <c:pt idx="5">
+                  <c:v>3.22</c:v>
+                </c:pt>
+                <c:pt idx="6">
+                  <c:v>3.18</c:v>
+                </c:pt>
+                <c:pt idx="7">
+                  <c:v>3.32</c:v>
+                </c:pt>
+                <c:pt idx="8">
+                  <c:v>3.36</c:v>
+                </c:pt>
+                <c:pt idx="9">
+                  <c:v>3.17</c:v>
+                </c:pt>
+                <c:pt idx="10">
+                  <c:v>3.19</c:v>
+                </c:pt>
+                <c:pt idx="11">
+                  <c:v>3.29</c:v>
+                </c:pt>
+                <c:pt idx="12">
+                  <c:v>3.38</c:v>
+                </c:pt>
+                <c:pt idx="13">
+                  <c:v>3.22</c:v>
+                </c:pt>
+                <c:pt idx="14">
+                  <c:v>3.35</c:v>
+                </c:pt>
+                <c:pt idx="15">
+                  <c:v>3.46</c:v>
+                </c:pt>
+                <c:pt idx="16">
+                  <c:v>3.61</c:v>
+                </c:pt>
+              </c:numCache>
+            </c:numRef>
+          </c:yVal>
+          <c:smooth val="0"/>
+        </c:ser>
+        <c:ser>
+          <c:idx val="1"/>
+          <c:order val="1"/>
+          <c:tx>
+            <c:strRef>
+              <c:f>Sheet1!$D$1</c:f>
+              <c:strCache>
+                <c:ptCount val="1"/>
+                <c:pt idx="0">
+                  <c:v>SQB: MHXS hisoboti asosida (yillik)</c:v>
+                </c:pt>
+              </c:strCache>
+            </c:strRef>
+          </c:tx>
+          <c:spPr>
+            <a:ln w="28575">
+              <a:solidFill>
+                <a:srgbClr val="EB6834"/>
+              </a:solidFill>
+            </a:ln>
+          </c:spPr>
+          <c:marker>
+            <c:symbol val="diamond"/>
+            <c:size val="7"/>
+            <c:spPr>
+              <a:solidFill>
+                <a:srgbClr val="EB6834"/>
+              </a:solidFill>
+              <a:ln>
+                <a:noFill/>
+              </a:ln>
+            </c:spPr>
+          </c:marker>
+          <c:dLbls>
             <c:dLbl>
               <c:idx val="5"/>
               <c:delete val="1"/>
@@ -9101,6 +10967,14 @@
             </c:dLbl>
             <c:dLbl>
               <c:idx val="10"/>
+              <c:delete val="1"/>
+            </c:dLbl>
+            <c:dLbl>
+              <c:idx val="11"/>
+              <c:delete val="1"/>
+            </c:dLbl>
+            <c:dLbl>
+              <c:idx val="12"/>
               <c:delete val="1"/>
             </c:dLbl>
             <c:dLbl>
@@ -9151,306 +11025,24 @@
           </c:dLbls>
           <c:xVal>
             <c:numRef>
-              <c:f>Sheet1!$A$2:$A$18</c:f>
-              <c:numCache>
-                <c:formatCode>General</c:formatCode>
-                <c:ptCount val="17"/>
-                <c:pt idx="0">
-                  <c:v>2021.75</c:v>
-                </c:pt>
-                <c:pt idx="1">
-                  <c:v>2022</c:v>
-                </c:pt>
-                <c:pt idx="2">
-                  <c:v>2022.25</c:v>
-                </c:pt>
-                <c:pt idx="3">
-                  <c:v>2022.5</c:v>
-                </c:pt>
-                <c:pt idx="4">
-                  <c:v>2022.75</c:v>
-                </c:pt>
-                <c:pt idx="5">
-                  <c:v>2023</c:v>
-                </c:pt>
-                <c:pt idx="6">
-                  <c:v>2023.25</c:v>
-                </c:pt>
-                <c:pt idx="7">
-                  <c:v>2023.5</c:v>
-                </c:pt>
-                <c:pt idx="8">
-                  <c:v>2023.75</c:v>
-                </c:pt>
-                <c:pt idx="9">
-                  <c:v>2024</c:v>
-                </c:pt>
-                <c:pt idx="10">
-                  <c:v>2024.25</c:v>
-                </c:pt>
-                <c:pt idx="11">
-                  <c:v>2024.5</c:v>
-                </c:pt>
-                <c:pt idx="12">
-                  <c:v>2024.75</c:v>
-                </c:pt>
-                <c:pt idx="13">
-                  <c:v>2025</c:v>
-                </c:pt>
-                <c:pt idx="14">
-                  <c:v>2025.25</c:v>
-                </c:pt>
-                <c:pt idx="15">
-                  <c:v>2025.5</c:v>
-                </c:pt>
-                <c:pt idx="16">
-                  <c:v>2025.75</c:v>
-                </c:pt>
-              </c:numCache>
-            </c:numRef>
-          </c:xVal>
-          <c:yVal>
-            <c:numRef>
-              <c:f>Sheet1!$B$2:$B$18</c:f>
-              <c:numCache>
-                <c:formatCode>General</c:formatCode>
-                <c:ptCount val="17"/>
-                <c:pt idx="0">
-                  <c:v>2.75</c:v>
-                </c:pt>
-                <c:pt idx="1">
-                  <c:v>2.68</c:v>
-                </c:pt>
-                <c:pt idx="2">
-                  <c:v>2.71</c:v>
-                </c:pt>
-                <c:pt idx="3">
-                  <c:v>2.72</c:v>
-                </c:pt>
-                <c:pt idx="4">
-                  <c:v>2.82</c:v>
-                </c:pt>
-                <c:pt idx="5">
-                  <c:v>2.67</c:v>
-                </c:pt>
-                <c:pt idx="6">
-                  <c:v>2.65</c:v>
-                </c:pt>
-                <c:pt idx="7">
-                  <c:v>2.68</c:v>
-                </c:pt>
-                <c:pt idx="8">
-                  <c:v>2.69</c:v>
-                </c:pt>
-                <c:pt idx="9">
-                  <c:v>2.62</c:v>
-                </c:pt>
-                <c:pt idx="10">
-                  <c:v>2.36</c:v>
-                </c:pt>
-                <c:pt idx="11">
-                  <c:v>2.38</c:v>
-                </c:pt>
-                <c:pt idx="12">
-                  <c:v>2.71</c:v>
-                </c:pt>
-                <c:pt idx="13">
-                  <c:v>2.67</c:v>
-                </c:pt>
-                <c:pt idx="14">
-                  <c:v>2.69</c:v>
-                </c:pt>
-                <c:pt idx="15">
-                  <c:v>2.9</c:v>
-                </c:pt>
-                <c:pt idx="16">
-                  <c:v>2.9</c:v>
-                </c:pt>
-              </c:numCache>
-            </c:numRef>
-          </c:yVal>
-          <c:smooth val="0"/>
-        </c:ser>
-        <c:ser>
-          <c:idx val="1"/>
-          <c:order val="1"/>
-          <c:tx>
-            <c:strRef>
-              <c:f>Sheet1!$D$1</c:f>
-              <c:strCache>
-                <c:ptCount val="1"/>
-                <c:pt idx="0">
-                  <c:v>«Biznesni rivojlantirish banki» ATB</c:v>
-                </c:pt>
-              </c:strCache>
-            </c:strRef>
-          </c:tx>
-          <c:spPr>
-            <a:ln w="28575">
-              <a:solidFill>
-                <a:srgbClr val="2A78D6"/>
-              </a:solidFill>
-            </a:ln>
-          </c:spPr>
-          <c:marker>
-            <c:symbol val="circle"/>
-            <c:size val="7"/>
-            <c:spPr>
-              <a:solidFill>
-                <a:srgbClr val="2A78D6"/>
-              </a:solidFill>
-              <a:ln>
-                <a:noFill/>
-              </a:ln>
-            </c:spPr>
-          </c:marker>
-          <c:dLbls>
-            <c:dLbl>
-              <c:idx val="0"/>
-              <c:delete val="1"/>
-            </c:dLbl>
-            <c:dLbl>
-              <c:idx val="1"/>
-              <c:delete val="1"/>
-            </c:dLbl>
-            <c:dLbl>
-              <c:idx val="2"/>
-              <c:delete val="1"/>
-            </c:dLbl>
-            <c:dLbl>
-              <c:idx val="3"/>
-              <c:delete val="1"/>
-            </c:dLbl>
-            <c:dLbl>
-              <c:idx val="4"/>
-              <c:delete val="1"/>
-            </c:dLbl>
-            <c:dLbl>
-              <c:idx val="5"/>
-              <c:delete val="1"/>
-            </c:dLbl>
-            <c:dLbl>
-              <c:idx val="6"/>
-              <c:delete val="1"/>
-            </c:dLbl>
-            <c:dLbl>
-              <c:idx val="7"/>
-              <c:delete val="1"/>
-            </c:dLbl>
-            <c:dLbl>
-              <c:idx val="10"/>
-              <c:delete val="1"/>
-            </c:dLbl>
-            <c:dLbl>
-              <c:idx val="11"/>
-              <c:delete val="1"/>
-            </c:dLbl>
-            <c:dLbl>
-              <c:idx val="12"/>
-              <c:delete val="1"/>
-            </c:dLbl>
-            <c:dLbl>
-              <c:idx val="13"/>
-              <c:delete val="1"/>
-            </c:dLbl>
-            <c:dLbl>
-              <c:idx val="14"/>
-              <c:delete val="1"/>
-            </c:dLbl>
-            <c:dLbl>
-              <c:idx val="15"/>
-              <c:delete val="1"/>
-            </c:dLbl>
-            <c:dLbl>
-              <c:idx val="16"/>
-              <c:delete val="1"/>
-            </c:dLbl>
-            <c:spPr>
-              <a:noFill/>
-              <a:ln>
-                <a:noFill/>
-              </a:ln>
-            </c:spPr>
-            <c:txPr>
-              <a:bodyPr/>
-              <a:lstStyle/>
-              <a:p>
-                <a:pPr>
-                  <a:defRPr sz="1000" b="1">
-                    <a:solidFill>
-                      <a:srgbClr val="2A78D6"/>
-                    </a:solidFill>
-                    <a:latin typeface="Times New Roman"/>
-                    <a:cs typeface="Times New Roman"/>
-                  </a:defRPr>
-                </a:pPr>
-                <a:endParaRPr lang="uz-Latn-UZ"/>
-              </a:p>
-            </c:txPr>
-            <c:dLblPos val="b"/>
-            <c:showLegendKey val="0"/>
-            <c:showVal val="1"/>
-            <c:showCatName val="0"/>
-            <c:showSerName val="0"/>
-            <c:showPercent val="0"/>
-            <c:showBubbleSize val="0"/>
-          </c:dLbls>
-          <c:xVal>
-            <c:numRef>
               <c:f>Sheet1!$C$2:$C$18</c:f>
               <c:numCache>
                 <c:formatCode>General</c:formatCode>
                 <c:ptCount val="17"/>
                 <c:pt idx="0">
-                  <c:v>2021.75</c:v>
+                  <c:v>2021.375</c:v>
                 </c:pt>
                 <c:pt idx="1">
-                  <c:v>2022</c:v>
+                  <c:v>2022.375</c:v>
                 </c:pt>
                 <c:pt idx="2">
-                  <c:v>2022.25</c:v>
+                  <c:v>2023.375</c:v>
                 </c:pt>
                 <c:pt idx="3">
-                  <c:v>2022.5</c:v>
+                  <c:v>2024.375</c:v>
                 </c:pt>
                 <c:pt idx="4">
-                  <c:v>2022.75</c:v>
-                </c:pt>
-                <c:pt idx="5">
-                  <c:v>2023</c:v>
-                </c:pt>
-                <c:pt idx="6">
-                  <c:v>2023.25</c:v>
-                </c:pt>
-                <c:pt idx="7">
-                  <c:v>2023.5</c:v>
-                </c:pt>
-                <c:pt idx="8">
-                  <c:v>2023.75</c:v>
-                </c:pt>
-                <c:pt idx="9">
-                  <c:v>2024</c:v>
-                </c:pt>
-                <c:pt idx="10">
-                  <c:v>2024.25</c:v>
-                </c:pt>
-                <c:pt idx="11">
-                  <c:v>2024.5</c:v>
-                </c:pt>
-                <c:pt idx="12">
-                  <c:v>2024.75</c:v>
-                </c:pt>
-                <c:pt idx="13">
-                  <c:v>2025</c:v>
-                </c:pt>
-                <c:pt idx="14">
-                  <c:v>2025.25</c:v>
-                </c:pt>
-                <c:pt idx="15">
-                  <c:v>2025.5</c:v>
-                </c:pt>
-                <c:pt idx="16">
-                  <c:v>2025.75</c:v>
+                  <c:v>2025.375</c:v>
                 </c:pt>
               </c:numCache>
             </c:numRef>
@@ -9461,50 +11053,20 @@
               <c:numCache>
                 <c:formatCode>General</c:formatCode>
                 <c:ptCount val="17"/>
+                <c:pt idx="0">
+                  <c:v>2.93</c:v>
+                </c:pt>
                 <c:pt idx="1">
-                  <c:v>2.67</c:v>
+                  <c:v>2.82</c:v>
                 </c:pt>
                 <c:pt idx="2">
-                  <c:v>2.71</c:v>
+                  <c:v>2.91</c:v>
                 </c:pt>
                 <c:pt idx="3">
-                  <c:v>2.93</c:v>
-                </c:pt>
-                <c:pt idx="5">
-                  <c:v>2.85</c:v>
-                </c:pt>
-                <c:pt idx="6">
-                  <c:v>2.65</c:v>
-                </c:pt>
-                <c:pt idx="7">
-                  <c:v>2.64</c:v>
-                </c:pt>
-                <c:pt idx="8">
-                  <c:v>2.44</c:v>
-                </c:pt>
-                <c:pt idx="9">
-                  <c:v>2.2</c:v>
-                </c:pt>
-                <c:pt idx="10">
-                  <c:v>2.3</c:v>
-                </c:pt>
-                <c:pt idx="11">
-                  <c:v>2.45</c:v>
-                </c:pt>
-                <c:pt idx="12">
+                  <c:v>2.75</c:v>
+                </c:pt>
+                <c:pt idx="4">
                   <c:v>2.83</c:v>
-                </c:pt>
-                <c:pt idx="13">
-                  <c:v>3.18</c:v>
-                </c:pt>
-                <c:pt idx="14">
-                  <c:v>3.28</c:v>
-                </c:pt>
-                <c:pt idx="15">
-                  <c:v>3.22</c:v>
-                </c:pt>
-                <c:pt idx="16">
-                  <c:v>3.15</c:v>
                 </c:pt>
               </c:numCache>
             </c:numRef>
@@ -9543,55 +11105,55 @@
                 <c:formatCode>General</c:formatCode>
                 <c:ptCount val="17"/>
                 <c:pt idx="0">
-                  <c:v>2021.75</c:v>
+                  <c:v>2021.375</c:v>
                 </c:pt>
                 <c:pt idx="1">
-                  <c:v>2022</c:v>
+                  <c:v>2021.625</c:v>
                 </c:pt>
                 <c:pt idx="2">
-                  <c:v>2022.25</c:v>
+                  <c:v>2021.875</c:v>
                 </c:pt>
                 <c:pt idx="3">
-                  <c:v>2022.5</c:v>
+                  <c:v>2022.125</c:v>
                 </c:pt>
                 <c:pt idx="4">
-                  <c:v>2022.75</c:v>
+                  <c:v>2022.375</c:v>
                 </c:pt>
                 <c:pt idx="5">
-                  <c:v>2023</c:v>
+                  <c:v>2022.625</c:v>
                 </c:pt>
                 <c:pt idx="6">
-                  <c:v>2023.25</c:v>
+                  <c:v>2022.875</c:v>
                 </c:pt>
                 <c:pt idx="7">
-                  <c:v>2023.5</c:v>
+                  <c:v>2023.125</c:v>
                 </c:pt>
                 <c:pt idx="8">
-                  <c:v>2023.75</c:v>
+                  <c:v>2023.375</c:v>
                 </c:pt>
                 <c:pt idx="9">
-                  <c:v>2024</c:v>
+                  <c:v>2023.625</c:v>
                 </c:pt>
                 <c:pt idx="10">
-                  <c:v>2024.25</c:v>
+                  <c:v>2023.875</c:v>
                 </c:pt>
                 <c:pt idx="11">
-                  <c:v>2024.5</c:v>
+                  <c:v>2024.125</c:v>
                 </c:pt>
                 <c:pt idx="12">
-                  <c:v>2024.75</c:v>
+                  <c:v>2024.375</c:v>
                 </c:pt>
                 <c:pt idx="13">
-                  <c:v>2025</c:v>
+                  <c:v>2024.625</c:v>
                 </c:pt>
                 <c:pt idx="14">
-                  <c:v>2025.25</c:v>
+                  <c:v>2024.875</c:v>
                 </c:pt>
                 <c:pt idx="15">
-                  <c:v>2025.5</c:v>
+                  <c:v>2025.125</c:v>
                 </c:pt>
                 <c:pt idx="16">
-                  <c:v>2025.75</c:v>
+                  <c:v>2025.375</c:v>
                 </c:pt>
               </c:numCache>
             </c:numRef>
@@ -9690,55 +11252,55 @@
                 <c:formatCode>General</c:formatCode>
                 <c:ptCount val="17"/>
                 <c:pt idx="0">
-                  <c:v>2021.75</c:v>
+                  <c:v>2021.375</c:v>
                 </c:pt>
                 <c:pt idx="1">
-                  <c:v>2022</c:v>
+                  <c:v>2021.625</c:v>
                 </c:pt>
                 <c:pt idx="2">
-                  <c:v>2022.25</c:v>
+                  <c:v>2021.875</c:v>
                 </c:pt>
                 <c:pt idx="3">
-                  <c:v>2022.5</c:v>
+                  <c:v>2022.125</c:v>
                 </c:pt>
                 <c:pt idx="4">
-                  <c:v>2022.75</c:v>
+                  <c:v>2022.375</c:v>
                 </c:pt>
                 <c:pt idx="5">
-                  <c:v>2023</c:v>
+                  <c:v>2022.625</c:v>
                 </c:pt>
                 <c:pt idx="6">
-                  <c:v>2023.25</c:v>
+                  <c:v>2022.875</c:v>
                 </c:pt>
                 <c:pt idx="7">
-                  <c:v>2023.5</c:v>
+                  <c:v>2023.125</c:v>
                 </c:pt>
                 <c:pt idx="8">
-                  <c:v>2023.75</c:v>
+                  <c:v>2023.375</c:v>
                 </c:pt>
                 <c:pt idx="9">
-                  <c:v>2024</c:v>
+                  <c:v>2023.625</c:v>
                 </c:pt>
                 <c:pt idx="10">
-                  <c:v>2024.25</c:v>
+                  <c:v>2023.875</c:v>
                 </c:pt>
                 <c:pt idx="11">
-                  <c:v>2024.5</c:v>
+                  <c:v>2024.125</c:v>
                 </c:pt>
                 <c:pt idx="12">
-                  <c:v>2024.75</c:v>
+                  <c:v>2024.375</c:v>
                 </c:pt>
                 <c:pt idx="13">
-                  <c:v>2025</c:v>
+                  <c:v>2024.625</c:v>
                 </c:pt>
                 <c:pt idx="14">
-                  <c:v>2025.25</c:v>
+                  <c:v>2024.875</c:v>
                 </c:pt>
                 <c:pt idx="15">
-                  <c:v>2025.5</c:v>
+                  <c:v>2025.125</c:v>
                 </c:pt>
                 <c:pt idx="16">
-                  <c:v>2025.75</c:v>
+                  <c:v>2025.375</c:v>
                 </c:pt>
               </c:numCache>
             </c:numRef>
@@ -9812,8 +11374,8 @@
         <c:axId val="333"/>
         <c:scaling>
           <c:orientation val="minMax"/>
-          <c:max val="2026"/>
-          <c:min val="2021.5"/>
+          <c:max val="2025.5"/>
+          <c:min val="2021"/>
         </c:scaling>
         <c:delete val="0"/>
         <c:axPos val="b"/>
@@ -9839,7 +11401,7 @@
                     </a:solidFill>
                     <a:latin typeface="Times New Roman"/>
                   </a:rPr>
-                  <a:t>Choraklar</a:t>
+                  <a:t>Yillar (choraklar)</a:t>
                 </a:r>
               </a:p>
             </c:rich>
@@ -9882,7 +11444,7 @@
         <c:axId val="444"/>
         <c:scaling>
           <c:orientation val="minMax"/>
-          <c:max val="3.5"/>
+          <c:max val="4.0"/>
           <c:min val="2.0"/>
         </c:scaling>
         <c:delete val="0"/>

</xml_diff>

<commit_message>
4.1.4-rasm: ma'lumot yo'q chorakda chiziq uzilmaydi; matnda izoh
Co-Authored-By: Claude Opus 5.5 <noreply@anthropic.com>
Claude-Session: https://claude.ai/code/session_01PxHTC8Q7yHdrpAeUA5KUgM
</commit_message>
<xml_diff>
--- a/paragraflar/4.1-paragraf.docx
+++ b/paragraflar/4.1-paragraf.docx
@@ -5485,7 +5485,7 @@
           <w:rFonts w:ascii="Times New Roman" w:hAnsi="Times New Roman" w:cs="Times New Roman" w:eastAsia="Times New Roman"/>
           <w:sz w:val="28"/>
         </w:rPr>
-        <w:t xml:space="preserve">Rasmdan ko‘rinib turibdiki, bankning integral indeksi 2022-yilda 2,67–2,93 ballni tashkil etgan bo‘lsa, 2023-yil III choragidagi 2,64 balldan 2023-yil IV choragida 2,44 ballgacha va 2024-yil I choragida 2,20 ballgacha pasaygan. Bu signal bankning 2024-yil I choragidagi 394,0 mlrd so‘mlik va IV choragidagi 1 952,0 mlrd so‘mlik zararlaridan oldin berilgan. Zarar va qayta kapitallashtirishdan keyin indeks 2025-yilda 3,15–3,28 ballgacha ko‘tarilib, yashil zona chegarasiga yetgan. Xuddi shunday signal «Garant bank» ATB da (2024-yil II–III choraklarida 2,55–2,57 ball), «Ipoteka-bank» ATB da (2024-yil III choragida 2,50 ball) va «Xalq banki» ATB da (2022-yilda 2,35–2,51 ball) ham kuzatilgan. Integral indeks o‘tkazib yuborgan yagona yirik hodisa «Tibisi bank» ATB ning 2022-yildagi zararlaridir: bank faoliyatining dastlabki bosqichida yuqori daromadlilik va kam muammoli kreditlar bilan uning indeksi 3,83 ballni tashkil etgan, zarar esa faoliyatning dastlabki bosqichidagi xarajatlar bilan bog‘liq bo‘lishi mumkin. Bu holat erta ogohlantirish tizimida integral indeks bilan bir qatorda kreditlar o‘sish sur’atini ham kuzatish lozimligini ko‘rsatadi.</w:t>
+        <w:t xml:space="preserve">Rasmdan ko‘rinib turibdiki, bankning integral indeksi 2022-yilda 2,67–2,93 ballni tashkil etgan bo‘lsa (2021-yil IV va 2022-yil IV choraklari bo‘yicha bankning daromad va likvidlik ko‘rsatkichlari ma’lumotlar bazasida mavjud emas, shu sababli bu choraklarda indeks hisoblanmagan), 2023-yil III choragidagi 2,64 balldan 2023-yil IV choragida 2,44 ballgacha va 2024-yil I choragida 2,20 ballgacha pasaygan. Bu signal bankning 2024-yil I choragidagi 394,0 mlrd so‘mlik va IV choragidagi 1 952,0 mlrd so‘mlik zararlaridan oldin berilgan. Zarar va qayta kapitallashtirishdan keyin indeks 2025-yilda 3,15–3,28 ballgacha ko‘tarilib, yashil zona chegarasiga yetgan. Xuddi shunday signal «Garant bank» ATB da (2024-yil II–III choraklarida 2,55–2,57 ball), «Ipoteka-bank» ATB da (2024-yil III choragida 2,50 ball) va «Xalq banki» ATB da (2022-yilda 2,35–2,51 ball) ham kuzatilgan. Integral indeks o‘tkazib yuborgan yagona yirik hodisa «Tibisi bank» ATB ning 2022-yildagi zararlaridir: bank faoliyatining dastlabki bosqichida yuqori daromadlilik va kam muammoli kreditlar bilan uning indeksi 3,83 ballni tashkil etgan, zarar esa faoliyatning dastlabki bosqichidagi xarajatlar bilan bog‘liq bo‘lishi mumkin. Bu holat erta ogohlantirish tizimida integral indeks bilan bir qatorda kreditlar o‘sish sur’atini ham kuzatish lozimligini ko‘rsatadi.</w:t>
       </w:r>
     </w:p>
     <w:p>
@@ -9891,7 +9891,7 @@
       </c:txPr>
     </c:legend>
     <c:plotVisOnly val="1"/>
-    <c:dispBlanksAs val="gap"/>
+    <c:dispBlanksAs val="span"/>
   </c:chart>
   <c:spPr>
     <a:solidFill>
@@ -10629,7 +10629,7 @@
       </c:txPr>
     </c:legend>
     <c:plotVisOnly val="1"/>
-    <c:dispBlanksAs val="gap"/>
+    <c:dispBlanksAs val="span"/>
   </c:chart>
   <c:spPr>
     <a:solidFill>
@@ -11547,7 +11547,7 @@
       </c:txPr>
     </c:legend>
     <c:plotVisOnly val="1"/>
-    <c:dispBlanksAs val="gap"/>
+    <c:dispBlanksAs val="span"/>
   </c:chart>
   <c:spPr>
     <a:solidFill>

</xml_diff>

<commit_message>
4.1.3-rasm: MKB milliy va MHXS hisoboti asosidagi indeks
Co-Authored-By: Claude Opus 5.5 <noreply@anthropic.com>
Claude-Session: https://claude.ai/code/session_01PxHTC8Q7yHdrpAeUA5KUgM
</commit_message>
<xml_diff>
--- a/paragraflar/4.1-paragraf.docx
+++ b/paragraflar/4.1-paragraf.docx
@@ -5400,7 +5400,7 @@
           <w:b/>
           <w:sz w:val="28"/>
         </w:rPr>
-        <w:t xml:space="preserve">4.1.3-rasm. «Mikrokreditbank» ATB da integral indeks dinamikasi va erta ogohlantirish chegaralari, 2021–2025-yillar</w:t>
+        <w:t xml:space="preserve">4.1.3-rasm. «Mikrokreditbank» ATB da milliy hisobot va MHXS hisoboti asosidagi integral indeks hamda erta ogohlantirish chegaralari, 2021–2025-yillar</w:t>
       </w:r>
       <w:r>
         <w:rPr>
@@ -5421,7 +5421,7 @@
           <w:rFonts w:ascii="Times New Roman" w:hAnsi="Times New Roman" w:cs="Times New Roman" w:eastAsia="Times New Roman"/>
           <w:sz w:val="28"/>
         </w:rPr>
-        <w:t xml:space="preserve">Rasmdan ko‘rinib turibdiki, bankning integral indeksi 2024-yil IV choragidagi yirik zarardan ancha oldin qizil zonada bo‘lgan. Indeks 2021–2023-yillarda 2,65–2,82 ballni tashkil etib, deyarli barcha choraklarda 2,75 ballik chegaradan pastda bo‘lgan, 2024-yil II–III choraklarida esa 2,36–2,38 ballgacha keskin pasaygan, ya’ni zarar tan olinishidan ikki chorak oldin qo‘shimcha signal bergan. Bu signal bank kapitalining 43 foizini yo‘qotishiga olib kelgan 1 707,7 mlrd so‘mlik chorak zararidan oldin berilgan. Zarar va qayta kapitallashtirishdan keyin indeks 2025-yilda 2,90 ballgacha oshib, sariq zonaga o‘tgan. «Biznesni rivojlantirish banki» ATB da ham xuddi shunday manzara kuzatilgan (4.1.4-rasm).</w:t>
+        <w:t xml:space="preserve">Rasmdan ko‘rinib turibdiki, bankning integral indeksi 2024-yil IV choragidagi yirik zarardan ancha oldin qizil zonada bo‘lgan. Milliy hisobot asosidagi indeks 2021–2023-yillarda 2,65–2,82 ballni tashkil etib, deyarli barcha choraklarda 2,75 ballik chegaradan pastda bo‘lgan, 2024-yil II–III choraklarida esa 2,36–2,38 ballgacha keskin pasaygan, ya’ni zarar tan olinishidan ikki chorak oldin qo‘shimcha signal bergan. Bu signal bank kapitalining 43 foizini yo‘qotishiga olib kelgan 1 707,7 mlrd so‘mlik chorak zararidan oldin berilgan. Zarar va qayta kapitallashtirishdan keyin indeks 2025-yilda 2,90 ballgacha oshib, sariq zonaga o‘tgan. MHXS hisobotlari asosida 3.2-paragrafda hisoblangan indeks esa butun davr mobaynida 2,20–2,47 ball bilan qizil zonada, ya’ni milliy indeksdan 0,4–0,5 ball pastda bo‘lgan. Bunga aktivlar sifati bloki (1,28–1,53 ball) va daromadlilik bloki (1,00–1,64 ball) sabab bo‘lgan: II bobda ko‘rsatilganidek, bank MHXS bo‘yicha zararni 2023-yildayoq tan olgan, milliy hisobotda esa u bir yil kechikib, 2024-yilda aks etgan. Demak, MHXS ma’lumotlari asosidagi indeks muammo haqida yanada barqaror va kuchli signal bergan, milliy indeks esa signalni faqat chegara atrofida bergan. «Biznesni rivojlantirish banki» ATB da ham xuddi shunday manzara kuzatilgan (4.1.4-rasm).</w:t>
       </w:r>
     </w:p>
     <w:p>
@@ -6687,7 +6687,7 @@
         <w:t xml:space="preserve"> </w:t>
       </w:r>
       <w:r>
-        <w:t xml:space="preserve">Tadqiqot natijasida muallif tomonidan 4.1.2-jadvalda ko‘rsatilgan manbalar ma’lumotlari asosida hisoblandi.</w:t>
+        <w:t xml:space="preserve">Tadqiqot natijasida muallif tomonidan quyidagi manbalar ma’lumotlari asosida hisoblandi: O‘zbekiston Respublikasi Markaziy banki. Banklar statistikasi: tijorat banklarining asosiy ko‘rsatkichlari va muammoli kreditlari to‘g‘risidagi oylik ma’lumotlar, 2021-yil aprel – 2026-yil yanvar. – https://cbu.uz/uz/statistics/bankstats/; «SNS» reyting agentligi. O‘zbekiston tijorat banklarining asosiy ko‘rsatkichlari bazasi (Banks_2025_IV, Banks_2026_II): 36 bank, 2021-yil IV chorak – 2026-yil II chorak; Акционерно-коммерческий банк «Микрокредитбанк». Консолидированная финансовая отчетность за год, закончившийся 31 декабря 2025 года, и заключение независимых аудиторов. – Ташкент, 2026. – С. 11–12; Акционерно-коммерческий банк «Микрокредитбанк». Финансовая отчетность за год, закончившийся 31 декабря 2023 года, и заключение независимых аудиторов. – Ташкент, 2024; Акционерно-коммерческий банк «Микрокредитбанк». Финансовая отчетность за год, закончившийся 31 декабря 2021 года, и заключение независимых аудиторов. – Ташкент, 2022.</w:t>
       </w:r>
     </w:p>
   </w:footnote>
@@ -9200,7 +9200,7 @@
               <c:strCache>
                 <c:ptCount val="1"/>
                 <c:pt idx="0">
-                  <c:v>«Mikrokreditbank» ATB</c:v>
+                  <c:v>MKB: milliy hisobot asosida (choraklik)</c:v>
                 </c:pt>
               </c:strCache>
             </c:strRef>
@@ -9208,16 +9208,16 @@
           <c:spPr>
             <a:ln w="28575">
               <a:solidFill>
-                <a:srgbClr val="EB6834"/>
+                <a:srgbClr val="2A78D6"/>
               </a:solidFill>
             </a:ln>
           </c:spPr>
           <c:marker>
-            <c:symbol val="square"/>
+            <c:symbol val="circle"/>
             <c:size val="7"/>
             <c:spPr>
               <a:solidFill>
-                <a:srgbClr val="EB6834"/>
+                <a:srgbClr val="2A78D6"/>
               </a:solidFill>
               <a:ln>
                 <a:noFill/>
@@ -9254,6 +9254,14 @@
               <c:delete val="1"/>
             </c:dLbl>
             <c:dLbl>
+              <c:idx val="9"/>
+              <c:delete val="1"/>
+            </c:dLbl>
+            <c:dLbl>
+              <c:idx val="11"/>
+              <c:delete val="1"/>
+            </c:dLbl>
+            <c:dLbl>
               <c:idx val="12"/>
               <c:delete val="1"/>
             </c:dLbl>
@@ -9263,6 +9271,244 @@
             </c:dLbl>
             <c:dLbl>
               <c:idx val="14"/>
+              <c:delete val="1"/>
+            </c:dLbl>
+            <c:dLbl>
+              <c:idx val="15"/>
+              <c:delete val="1"/>
+            </c:dLbl>
+            <c:spPr>
+              <a:noFill/>
+              <a:ln>
+                <a:noFill/>
+              </a:ln>
+            </c:spPr>
+            <c:txPr>
+              <a:bodyPr/>
+              <a:lstStyle/>
+              <a:p>
+                <a:pPr>
+                  <a:defRPr sz="1000" b="1">
+                    <a:solidFill>
+                      <a:srgbClr val="2A78D6"/>
+                    </a:solidFill>
+                    <a:latin typeface="Times New Roman"/>
+                    <a:cs typeface="Times New Roman"/>
+                  </a:defRPr>
+                </a:pPr>
+                <a:endParaRPr lang="uz-Latn-UZ"/>
+              </a:p>
+            </c:txPr>
+            <c:dLblPos val="b"/>
+            <c:showLegendKey val="0"/>
+            <c:showVal val="1"/>
+            <c:showCatName val="0"/>
+            <c:showSerName val="0"/>
+            <c:showPercent val="0"/>
+            <c:showBubbleSize val="0"/>
+          </c:dLbls>
+          <c:xVal>
+            <c:numRef>
+              <c:f>Sheet1!$A$2:$A$18</c:f>
+              <c:numCache>
+                <c:formatCode>General</c:formatCode>
+                <c:ptCount val="17"/>
+                <c:pt idx="0">
+                  <c:v>2021.375</c:v>
+                </c:pt>
+                <c:pt idx="1">
+                  <c:v>2021.625</c:v>
+                </c:pt>
+                <c:pt idx="2">
+                  <c:v>2021.875</c:v>
+                </c:pt>
+                <c:pt idx="3">
+                  <c:v>2022.125</c:v>
+                </c:pt>
+                <c:pt idx="4">
+                  <c:v>2022.375</c:v>
+                </c:pt>
+                <c:pt idx="5">
+                  <c:v>2022.625</c:v>
+                </c:pt>
+                <c:pt idx="6">
+                  <c:v>2022.875</c:v>
+                </c:pt>
+                <c:pt idx="7">
+                  <c:v>2023.125</c:v>
+                </c:pt>
+                <c:pt idx="8">
+                  <c:v>2023.375</c:v>
+                </c:pt>
+                <c:pt idx="9">
+                  <c:v>2023.625</c:v>
+                </c:pt>
+                <c:pt idx="10">
+                  <c:v>2023.875</c:v>
+                </c:pt>
+                <c:pt idx="11">
+                  <c:v>2024.125</c:v>
+                </c:pt>
+                <c:pt idx="12">
+                  <c:v>2024.375</c:v>
+                </c:pt>
+                <c:pt idx="13">
+                  <c:v>2024.625</c:v>
+                </c:pt>
+                <c:pt idx="14">
+                  <c:v>2024.875</c:v>
+                </c:pt>
+                <c:pt idx="15">
+                  <c:v>2025.125</c:v>
+                </c:pt>
+                <c:pt idx="16">
+                  <c:v>2025.375</c:v>
+                </c:pt>
+              </c:numCache>
+            </c:numRef>
+          </c:xVal>
+          <c:yVal>
+            <c:numRef>
+              <c:f>Sheet1!$B$2:$B$18</c:f>
+              <c:numCache>
+                <c:formatCode>General</c:formatCode>
+                <c:ptCount val="17"/>
+                <c:pt idx="0">
+                  <c:v>2.75</c:v>
+                </c:pt>
+                <c:pt idx="1">
+                  <c:v>2.68</c:v>
+                </c:pt>
+                <c:pt idx="2">
+                  <c:v>2.71</c:v>
+                </c:pt>
+                <c:pt idx="3">
+                  <c:v>2.72</c:v>
+                </c:pt>
+                <c:pt idx="4">
+                  <c:v>2.82</c:v>
+                </c:pt>
+                <c:pt idx="5">
+                  <c:v>2.67</c:v>
+                </c:pt>
+                <c:pt idx="6">
+                  <c:v>2.65</c:v>
+                </c:pt>
+                <c:pt idx="7">
+                  <c:v>2.68</c:v>
+                </c:pt>
+                <c:pt idx="8">
+                  <c:v>2.69</c:v>
+                </c:pt>
+                <c:pt idx="9">
+                  <c:v>2.62</c:v>
+                </c:pt>
+                <c:pt idx="10">
+                  <c:v>2.36</c:v>
+                </c:pt>
+                <c:pt idx="11">
+                  <c:v>2.38</c:v>
+                </c:pt>
+                <c:pt idx="12">
+                  <c:v>2.71</c:v>
+                </c:pt>
+                <c:pt idx="13">
+                  <c:v>2.67</c:v>
+                </c:pt>
+                <c:pt idx="14">
+                  <c:v>2.69</c:v>
+                </c:pt>
+                <c:pt idx="15">
+                  <c:v>2.9</c:v>
+                </c:pt>
+                <c:pt idx="16">
+                  <c:v>2.9</c:v>
+                </c:pt>
+              </c:numCache>
+            </c:numRef>
+          </c:yVal>
+          <c:smooth val="0"/>
+        </c:ser>
+        <c:ser>
+          <c:idx val="1"/>
+          <c:order val="1"/>
+          <c:tx>
+            <c:strRef>
+              <c:f>Sheet1!$D$1</c:f>
+              <c:strCache>
+                <c:ptCount val="1"/>
+                <c:pt idx="0">
+                  <c:v>MKB: MHXS hisoboti asosida (yillik)</c:v>
+                </c:pt>
+              </c:strCache>
+            </c:strRef>
+          </c:tx>
+          <c:spPr>
+            <a:ln w="28575">
+              <a:solidFill>
+                <a:srgbClr val="EB6834"/>
+              </a:solidFill>
+            </a:ln>
+          </c:spPr>
+          <c:marker>
+            <c:symbol val="diamond"/>
+            <c:size val="7"/>
+            <c:spPr>
+              <a:solidFill>
+                <a:srgbClr val="EB6834"/>
+              </a:solidFill>
+              <a:ln>
+                <a:noFill/>
+              </a:ln>
+            </c:spPr>
+          </c:marker>
+          <c:dLbls>
+            <c:dLbl>
+              <c:idx val="5"/>
+              <c:delete val="1"/>
+            </c:dLbl>
+            <c:dLbl>
+              <c:idx val="6"/>
+              <c:delete val="1"/>
+            </c:dLbl>
+            <c:dLbl>
+              <c:idx val="7"/>
+              <c:delete val="1"/>
+            </c:dLbl>
+            <c:dLbl>
+              <c:idx val="8"/>
+              <c:delete val="1"/>
+            </c:dLbl>
+            <c:dLbl>
+              <c:idx val="9"/>
+              <c:delete val="1"/>
+            </c:dLbl>
+            <c:dLbl>
+              <c:idx val="10"/>
+              <c:delete val="1"/>
+            </c:dLbl>
+            <c:dLbl>
+              <c:idx val="11"/>
+              <c:delete val="1"/>
+            </c:dLbl>
+            <c:dLbl>
+              <c:idx val="12"/>
+              <c:delete val="1"/>
+            </c:dLbl>
+            <c:dLbl>
+              <c:idx val="13"/>
+              <c:delete val="1"/>
+            </c:dLbl>
+            <c:dLbl>
+              <c:idx val="14"/>
+              <c:delete val="1"/>
+            </c:dLbl>
+            <c:dLbl>
+              <c:idx val="15"/>
+              <c:delete val="1"/>
+            </c:dLbl>
+            <c:dLbl>
+              <c:idx val="16"/>
               <c:delete val="1"/>
             </c:dLbl>
             <c:spPr>
@@ -9297,7 +9543,7 @@
           </c:dLbls>
           <c:xVal>
             <c:numRef>
-              <c:f>Sheet1!$A$2:$A$18</c:f>
+              <c:f>Sheet1!$C$2:$C$18</c:f>
               <c:numCache>
                 <c:formatCode>General</c:formatCode>
                 <c:ptCount val="17"/>
@@ -9305,51 +9551,15 @@
                   <c:v>2021.375</c:v>
                 </c:pt>
                 <c:pt idx="1">
-                  <c:v>2021.625</c:v>
+                  <c:v>2022.375</c:v>
                 </c:pt>
                 <c:pt idx="2">
-                  <c:v>2021.875</c:v>
+                  <c:v>2023.375</c:v>
                 </c:pt>
                 <c:pt idx="3">
-                  <c:v>2022.125</c:v>
+                  <c:v>2024.375</c:v>
                 </c:pt>
                 <c:pt idx="4">
-                  <c:v>2022.375</c:v>
-                </c:pt>
-                <c:pt idx="5">
-                  <c:v>2022.625</c:v>
-                </c:pt>
-                <c:pt idx="6">
-                  <c:v>2022.875</c:v>
-                </c:pt>
-                <c:pt idx="7">
-                  <c:v>2023.125</c:v>
-                </c:pt>
-                <c:pt idx="8">
-                  <c:v>2023.375</c:v>
-                </c:pt>
-                <c:pt idx="9">
-                  <c:v>2023.625</c:v>
-                </c:pt>
-                <c:pt idx="10">
-                  <c:v>2023.875</c:v>
-                </c:pt>
-                <c:pt idx="11">
-                  <c:v>2024.125</c:v>
-                </c:pt>
-                <c:pt idx="12">
-                  <c:v>2024.375</c:v>
-                </c:pt>
-                <c:pt idx="13">
-                  <c:v>2024.625</c:v>
-                </c:pt>
-                <c:pt idx="14">
-                  <c:v>2024.875</c:v>
-                </c:pt>
-                <c:pt idx="15">
-                  <c:v>2025.125</c:v>
-                </c:pt>
-                <c:pt idx="16">
                   <c:v>2025.375</c:v>
                 </c:pt>
               </c:numCache>
@@ -9357,60 +9567,24 @@
           </c:xVal>
           <c:yVal>
             <c:numRef>
-              <c:f>Sheet1!$B$2:$B$18</c:f>
+              <c:f>Sheet1!$D$2:$D$18</c:f>
               <c:numCache>
                 <c:formatCode>General</c:formatCode>
                 <c:ptCount val="17"/>
                 <c:pt idx="0">
-                  <c:v>2.75</c:v>
+                  <c:v>2.2</c:v>
                 </c:pt>
                 <c:pt idx="1">
-                  <c:v>2.68</c:v>
+                  <c:v>2.31</c:v>
                 </c:pt>
                 <c:pt idx="2">
-                  <c:v>2.71</c:v>
+                  <c:v>2.22</c:v>
                 </c:pt>
                 <c:pt idx="3">
-                  <c:v>2.72</c:v>
+                  <c:v>2.24</c:v>
                 </c:pt>
                 <c:pt idx="4">
-                  <c:v>2.82</c:v>
-                </c:pt>
-                <c:pt idx="5">
-                  <c:v>2.67</c:v>
-                </c:pt>
-                <c:pt idx="6">
-                  <c:v>2.65</c:v>
-                </c:pt>
-                <c:pt idx="7">
-                  <c:v>2.68</c:v>
-                </c:pt>
-                <c:pt idx="8">
-                  <c:v>2.69</c:v>
-                </c:pt>
-                <c:pt idx="9">
-                  <c:v>2.62</c:v>
-                </c:pt>
-                <c:pt idx="10">
-                  <c:v>2.36</c:v>
-                </c:pt>
-                <c:pt idx="11">
-                  <c:v>2.38</c:v>
-                </c:pt>
-                <c:pt idx="12">
-                  <c:v>2.71</c:v>
-                </c:pt>
-                <c:pt idx="13">
-                  <c:v>2.67</c:v>
-                </c:pt>
-                <c:pt idx="14">
-                  <c:v>2.69</c:v>
-                </c:pt>
-                <c:pt idx="15">
-                  <c:v>2.9</c:v>
-                </c:pt>
-                <c:pt idx="16">
-                  <c:v>2.9</c:v>
+                  <c:v>2.47</c:v>
                 </c:pt>
               </c:numCache>
             </c:numRef>
@@ -9418,11 +9592,11 @@
           <c:smooth val="0"/>
         </c:ser>
         <c:ser>
-          <c:idx val="1"/>
-          <c:order val="1"/>
+          <c:idx val="2"/>
+          <c:order val="2"/>
           <c:tx>
             <c:strRef>
-              <c:f>Sheet1!$D$1</c:f>
+              <c:f>Sheet1!$F$1</c:f>
               <c:strCache>
                 <c:ptCount val="1"/>
                 <c:pt idx="0">
@@ -9444,7 +9618,7 @@
           </c:marker>
           <c:xVal>
             <c:numRef>
-              <c:f>Sheet1!$C$2:$C$18</c:f>
+              <c:f>Sheet1!$E$2:$E$18</c:f>
               <c:numCache>
                 <c:formatCode>General</c:formatCode>
                 <c:ptCount val="17"/>
@@ -9504,7 +9678,7 @@
           </c:xVal>
           <c:yVal>
             <c:numRef>
-              <c:f>Sheet1!$D$2:$D$18</c:f>
+              <c:f>Sheet1!$F$2:$F$18</c:f>
               <c:numCache>
                 <c:formatCode>General</c:formatCode>
                 <c:ptCount val="17"/>
@@ -9565,11 +9739,11 @@
           <c:smooth val="0"/>
         </c:ser>
         <c:ser>
-          <c:idx val="2"/>
-          <c:order val="2"/>
+          <c:idx val="3"/>
+          <c:order val="3"/>
           <c:tx>
             <c:strRef>
-              <c:f>Sheet1!$F$1</c:f>
+              <c:f>Sheet1!$H$1</c:f>
               <c:strCache>
                 <c:ptCount val="1"/>
                 <c:pt idx="0">
@@ -9591,7 +9765,7 @@
           </c:marker>
           <c:xVal>
             <c:numRef>
-              <c:f>Sheet1!$E$2:$E$18</c:f>
+              <c:f>Sheet1!$G$2:$G$18</c:f>
               <c:numCache>
                 <c:formatCode>General</c:formatCode>
                 <c:ptCount val="17"/>
@@ -9651,7 +9825,7 @@
           </c:xVal>
           <c:yVal>
             <c:numRef>
-              <c:f>Sheet1!$F$2:$F$18</c:f>
+              <c:f>Sheet1!$H$2:$H$18</c:f>
               <c:numCache>
                 <c:formatCode>General</c:formatCode>
                 <c:ptCount val="17"/>
@@ -9789,7 +9963,7 @@
         <c:scaling>
           <c:orientation val="minMax"/>
           <c:max val="4.0"/>
-          <c:min val="2.0"/>
+          <c:min val="1.75"/>
         </c:scaling>
         <c:delete val="0"/>
         <c:axPos val="l"/>
@@ -10527,7 +10701,7 @@
         <c:scaling>
           <c:orientation val="minMax"/>
           <c:max val="4.0"/>
-          <c:min val="2.0"/>
+          <c:min val="1.75"/>
         </c:scaling>
         <c:delete val="0"/>
         <c:axPos val="l"/>
@@ -11445,7 +11619,7 @@
         <c:scaling>
           <c:orientation val="minMax"/>
           <c:max val="4.0"/>
-          <c:min val="2.0"/>
+          <c:min val="1.75"/>
         </c:scaling>
         <c:delete val="0"/>
         <c:axPos val="l"/>

</xml_diff>

<commit_message>
4.1: BRB rasmi olib tashlandi, matnda bir jumla qoldi; SQB rasmi 4.1.4
Co-Authored-By: Claude Opus 5.5 <noreply@anthropic.com>
Claude-Session: https://claude.ai/code/session_01PxHTC8Q7yHdrpAeUA5KUgM
</commit_message>
<xml_diff>
--- a/paragraflar/4.1-paragraf.docx
+++ b/paragraflar/4.1-paragraf.docx
@@ -2,7 +2,7 @@
 <file path=word/document.xml><?xml version="1.0" encoding="utf-8"?>
 <w:document xmlns:w="http://schemas.openxmlformats.org/wordprocessingml/2006/main" xmlns:m="http://schemas.openxmlformats.org/officeDocument/2006/math" xmlns:r="http://schemas.openxmlformats.org/officeDocument/2006/relationships" xmlns:o="urn:schemas-microsoft-com:office:office" xmlns:v="urn:schemas-microsoft-com:vml" xmlns:w10="urn:schemas-microsoft-com:office:word" xmlns:a="http://schemas.openxmlformats.org/drawingml/2006/main" xmlns:pic="http://schemas.openxmlformats.org/drawingml/2006/picture" xmlns:wp="http://schemas.openxmlformats.org/drawingml/2006/wordprocessingDrawing">
   <w:body>
-    <w:bookmarkStart w:id="47" w:name="X1595b54503e12f06e30c058f5d96c2dde3d42ae"/>
+    <w:bookmarkStart w:id="46" w:name="X1595b54503e12f06e30c058f5d96c2dde3d42ae"/>
     <w:p>
       <w:pPr>
         <w:pStyle w:val="Heading2"/>
@@ -5357,7 +5357,7 @@
           <w:rFonts w:ascii="Times New Roman" w:hAnsi="Times New Roman" w:cs="Times New Roman" w:eastAsia="Times New Roman"/>
           <w:sz w:val="28"/>
         </w:rPr>
-        <w:t xml:space="preserve">Integral indeksning erta ogohlantirish signalini qanday berganini 2024-yilda eng yirik zarar ko‘rgan ikki bank va tadqiqotning asosiy obyekti bo‘lgan «O‘zsanoatqurilishbank» ATB misolida ko‘rib chiqish mumkin. Dastlab «Mikrokreditbank» ATB ning integral indeksi dinamikasini ko‘rib chiqamiz (4.1.3-rasm).</w:t>
+        <w:t xml:space="preserve">Integral indeksning erta ogohlantirish signalini qanday berganini tadqiqotning asosiy obyektlari bo‘lgan «Mikrokreditbank» ATB va «O‘zsanoatqurilishbank» ATB misolida ko‘rib chiqish mumkin. Dastlab «Mikrokreditbank» ATB ning integral indeksi dinamikasini ko‘rib chiqamiz (4.1.3-rasm).</w:t>
       </w:r>
     </w:p>
     <w:p>
@@ -5421,7 +5421,22 @@
           <w:rFonts w:ascii="Times New Roman" w:hAnsi="Times New Roman" w:cs="Times New Roman" w:eastAsia="Times New Roman"/>
           <w:sz w:val="28"/>
         </w:rPr>
-        <w:t xml:space="preserve">Rasmdan ko‘rinib turibdiki, bankning integral indeksi 2024-yil IV choragidagi yirik zarardan ancha oldin qizil zonada bo‘lgan. Milliy hisobot asosidagi indeks 2021–2023-yillarda 2,65–2,82 ballni tashkil etib, deyarli barcha choraklarda 2,75 ballik chegaradan pastda bo‘lgan, 2024-yil II–III choraklarida esa 2,36–2,38 ballgacha keskin pasaygan, ya’ni zarar tan olinishidan ikki chorak oldin qo‘shimcha signal bergan. Bu signal bank kapitalining 43 foizini yo‘qotishiga olib kelgan 1 707,7 mlrd so‘mlik chorak zararidan oldin berilgan. Zarar va qayta kapitallashtirishdan keyin indeks 2025-yilda 2,90 ballgacha oshib, sariq zonaga o‘tgan. MHXS hisobotlari asosida 3.2-paragrafda hisoblangan indeks esa butun davr mobaynida 2,20–2,47 ball bilan qizil zonada, ya’ni milliy indeksdan 0,4–0,5 ball pastda bo‘lgan. Bunga aktivlar sifati bloki (1,28–1,53 ball) va daromadlilik bloki (1,00–1,64 ball) sabab bo‘lgan: II bobda ko‘rsatilganidek, bank MHXS bo‘yicha zararni 2023-yildayoq tan olgan, milliy hisobotda esa u bir yil kechikib, 2024-yilda aks etgan. Demak, MHXS ma’lumotlari asosidagi indeks muammo haqida yanada barqaror va kuchli signal bergan, milliy indeks esa signalni faqat chegara atrofida bergan. «Biznesni rivojlantirish banki» ATB da ham xuddi shunday manzara kuzatilgan (4.1.4-rasm).</w:t>
+        <w:t xml:space="preserve">Rasmdan ko‘rinib turibdiki, bankning integral indeksi 2024-yil IV choragidagi yirik zarardan ancha oldin qizil zonada bo‘lgan. Milliy hisobot asosidagi indeks 2021–2023-yillarda 2,65–2,82 ballni tashkil etib, deyarli barcha choraklarda 2,75 ballik chegaradan pastda bo‘lgan, 2024-yil II–III choraklarida esa 2,36–2,38 ballgacha keskin pasaygan, ya’ni zarar tan olinishidan ikki chorak oldin qo‘shimcha signal bergan. Bu signal bank kapitalining 43 foizini yo‘qotishiga olib kelgan 1 707,7 mlrd so‘mlik chorak zararidan oldin berilgan. Zarar va qayta kapitallashtirishdan keyin indeks 2025-yilda 2,90 ballgacha oshib, sariq zonaga o‘tgan. MHXS hisobotlari asosida 3.2-paragrafda hisoblangan indeks esa butun davr mobaynida 2,20–2,47 ball bilan qizil zonada, ya’ni milliy indeksdan 0,4–0,5 ball pastda bo‘lgan. Bunga aktivlar sifati bloki (1,28–1,53 ball) va daromadlilik bloki (1,00–1,64 ball) sabab bo‘lgan: II bobda ko‘rsatilganidek, bank MHXS bo‘yicha zararni 2023-yildayoq tan olgan, milliy hisobotda esa u bir yil kechikib, 2024-yilda aks etgan. Demak, MHXS ma’lumotlari asosidagi indeks muammo haqida yanada barqaror va kuchli signal bergan, milliy indeks esa signalni faqat chegara atrofida bergan. Xuddi shunday manzara 2024-yilda kapitalining 48 foizini yo‘qotgan «Biznesni rivojlantirish banki» ATB da ham kuzatilgan: uning indeksi 2023-yil IV choragida 2,44 ballgacha va 2024-yil I choragida 2,20 ballgacha pasayib, zararlardan 3–4 chorak oldin qizil zonaga tushgan. Shunga o‘xshash signal «Garant bank» ATB da (2024-yil II–III choraklarida 2,55–2,57 ball), «Ipoteka-bank» ATB da (2024-yil III choragida 2,50 ball) va «Xalq banki» ATB da (2022-yilda 2,35–2,51 ball) ham kuzatilgan. Integral indeks o‘tkazib yuborgan yagona yirik hodisa «Tibisi bank» ATB ning 2022-yildagi zararlaridir: bank faoliyatining dastlabki bosqichida yuqori daromadlilik va kam muammoli kreditlar bilan uning indeksi 3,83 ballni tashkil etgan, zarar esa faoliyatning dastlabki bosqichidagi xarajatlar bilan bog‘liq bo‘lishi mumkin. Bu holat erta ogohlantirish tizimida integral indeks bilan bir qatorda kreditlar o‘sish sur’atini ham kuzatish lozimligini ko‘rsatadi.</w:t>
+      </w:r>
+    </w:p>
+    <w:p>
+      <w:pPr>
+        <w:pStyle w:val="BodyText"/>
+        <w:spacing w:line="360" w:lineRule="auto" w:before="0" w:after="0"/>
+        <w:ind w:firstLine="709"/>
+        <w:jc w:val="both"/>
+      </w:pPr>
+      <w:r>
+        <w:rPr>
+          <w:rFonts w:ascii="Times New Roman" w:hAnsi="Times New Roman" w:cs="Times New Roman" w:eastAsia="Times New Roman"/>
+          <w:sz w:val="28"/>
+        </w:rPr>
+        <w:t xml:space="preserve">Erta ogohlantirish tizimining milliy va MHXS hisobotlari o‘rtasidagi tafovutga sezgirligini «O‘zsanoatqurilishbank» ATB misolida ko‘rish mumkin. Tahlil davrida bank muammo hodisasiga uchramagan, uning choraklik sof foydasi barcha choraklarda ijobiy bo‘lgan. Bank uchun integral indeks ikki variantda – milliy hisobot asosidagi choraklik panel indeksi va 3.2-paragrafda MHXS hisobotlari asosida hisoblangan yillik indeks sifatida taqqoslandi (4.1.4-rasm).</w:t>
       </w:r>
     </w:p>
     <w:p>
@@ -5464,92 +5479,13 @@
           <w:b/>
           <w:sz w:val="28"/>
         </w:rPr>
-        <w:t xml:space="preserve">4.1.4-rasm. «Biznesni rivojlantirish banki» ATB da integral indeks dinamikasi va erta ogohlantirish chegaralari, 2021–2025-yillar</w:t>
+        <w:t xml:space="preserve">4.1.4-rasm. «O‘zsanoatqurilishbank» ATB da milliy hisobot va MHXS hisoboti asosidagi integral indeks hamda erta ogohlantirish chegaralari, 2021–2025-yillar</w:t>
       </w:r>
       <w:r>
         <w:rPr>
           <w:rStyle w:val="FootnoteReference"/>
         </w:rPr>
         <w:footnoteReference w:id="44"/>
-      </w:r>
-    </w:p>
-    <w:p>
-      <w:pPr>
-        <w:pStyle w:val="BodyText"/>
-        <w:spacing w:line="360" w:lineRule="auto" w:before="0" w:after="0"/>
-        <w:ind w:firstLine="709"/>
-        <w:jc w:val="both"/>
-      </w:pPr>
-      <w:r>
-        <w:rPr>
-          <w:rFonts w:ascii="Times New Roman" w:hAnsi="Times New Roman" w:cs="Times New Roman" w:eastAsia="Times New Roman"/>
-          <w:sz w:val="28"/>
-        </w:rPr>
-        <w:t xml:space="preserve">Rasmdan ko‘rinib turibdiki, bankning integral indeksi 2022-yilda 2,67–2,93 ballni tashkil etgan bo‘lsa (2021-yil IV va 2022-yil IV choraklari bo‘yicha bankning daromad va likvidlik ko‘rsatkichlari ma’lumotlar bazasida mavjud emas, shu sababli bu choraklarda indeks hisoblanmagan), 2023-yil III choragidagi 2,64 balldan 2023-yil IV choragida 2,44 ballgacha va 2024-yil I choragida 2,20 ballgacha pasaygan. Bu signal bankning 2024-yil I choragidagi 394,0 mlrd so‘mlik va IV choragidagi 1 952,0 mlrd so‘mlik zararlaridan oldin berilgan. Zarar va qayta kapitallashtirishdan keyin indeks 2025-yilda 3,15–3,28 ballgacha ko‘tarilib, yashil zona chegarasiga yetgan. Xuddi shunday signal «Garant bank» ATB da (2024-yil II–III choraklarida 2,55–2,57 ball), «Ipoteka-bank» ATB da (2024-yil III choragida 2,50 ball) va «Xalq banki» ATB da (2022-yilda 2,35–2,51 ball) ham kuzatilgan. Integral indeks o‘tkazib yuborgan yagona yirik hodisa «Tibisi bank» ATB ning 2022-yildagi zararlaridir: bank faoliyatining dastlabki bosqichida yuqori daromadlilik va kam muammoli kreditlar bilan uning indeksi 3,83 ballni tashkil etgan, zarar esa faoliyatning dastlabki bosqichidagi xarajatlar bilan bog‘liq bo‘lishi mumkin. Bu holat erta ogohlantirish tizimida integral indeks bilan bir qatorda kreditlar o‘sish sur’atini ham kuzatish lozimligini ko‘rsatadi.</w:t>
-      </w:r>
-    </w:p>
-    <w:p>
-      <w:pPr>
-        <w:pStyle w:val="BodyText"/>
-        <w:spacing w:line="360" w:lineRule="auto" w:before="0" w:after="0"/>
-        <w:ind w:firstLine="709"/>
-        <w:jc w:val="both"/>
-      </w:pPr>
-      <w:r>
-        <w:rPr>
-          <w:rFonts w:ascii="Times New Roman" w:hAnsi="Times New Roman" w:cs="Times New Roman" w:eastAsia="Times New Roman"/>
-          <w:sz w:val="28"/>
-        </w:rPr>
-        <w:t xml:space="preserve">Erta ogohlantirish tizimining milliy va MHXS hisobotlari o‘rtasidagi tafovutga sezgirligini «O‘zsanoatqurilishbank» ATB misolida ko‘rish mumkin. Tahlil davrida bank muammo hodisasiga uchramagan, uning choraklik sof foydasi barcha choraklarda ijobiy bo‘lgan. Bank uchun integral indeks ikki variantda – milliy hisobot asosidagi choraklik panel indeksi va 3.2-paragrafda MHXS hisobotlari asosida hisoblangan yillik indeks sifatida taqqoslandi (4.1.5-rasm).</w:t>
-      </w:r>
-    </w:p>
-    <w:p>
-      <w:pPr>
-        <w:pStyle w:val="BodyText"/>
-        <w:keepNext/>
-        <w:spacing w:line="240" w:lineRule="auto" w:before="0" w:after="0"/>
-        <w:ind w:firstLine="0"/>
-        <w:jc w:val="center"/>
-      </w:pPr>
-      <w:r xmlns:c="http://schemas.openxmlformats.org/drawingml/2006/chart">
-        <w:rPr>
-          <w:noProof/>
-        </w:rPr>
-        <w:drawing>
-          <wp:inline distT="0" distB="0" distL="0" distR="0">
-            <wp:extent cx="5760000" cy="2880000"/>
-            <wp:effectExtent l="0" t="0" r="0" b="0"/>
-            <wp:docPr id="1005" name="4.1.5-rasm"/>
-            <wp:cNvGraphicFramePr/>
-            <a:graphic>
-              <a:graphicData uri="http://schemas.openxmlformats.org/drawingml/2006/chart">
-                <c:chart r:id="rId13"/>
-              </a:graphicData>
-            </a:graphic>
-          </wp:inline>
-        </w:drawing>
-      </w:r>
-    </w:p>
-    <w:p>
-      <w:pPr>
-        <w:pStyle w:val="BodyText"/>
-        <w:spacing w:line="240" w:lineRule="auto" w:before="120" w:after="240"/>
-        <w:ind w:firstLine="0"/>
-        <w:jc w:val="center"/>
-      </w:pPr>
-      <w:r>
-        <w:rPr>
-          <w:rFonts w:ascii="Times New Roman" w:hAnsi="Times New Roman" w:cs="Times New Roman" w:eastAsia="Times New Roman"/>
-          <w:b/>
-          <w:sz w:val="28"/>
-        </w:rPr>
-        <w:t xml:space="preserve">4.1.5-rasm. «O‘zsanoatqurilishbank» ATB da milliy hisobot va MHXS hisoboti asosidagi integral indeks hamda erta ogohlantirish chegaralari, 2021–2025-yillar</w:t>
-      </w:r>
-      <w:r>
-        <w:rPr>
-          <w:rStyle w:val="FootnoteReference"/>
-        </w:rPr>
-        <w:footnoteReference w:id="45"/>
       </w:r>
     </w:p>
     <w:p>
@@ -5620,7 +5556,7 @@
         <w:rPr>
           <w:rStyle w:val="FootnoteReference"/>
         </w:rPr>
-        <w:footnoteReference w:id="46"/>
+        <w:footnoteReference w:id="45"/>
       </w:r>
     </w:p>
     <w:tbl>
@@ -6207,7 +6143,7 @@
         <w:t xml:space="preserve">Shunday qilib, tahlil natijalari 3.1-paragrafda taklif etilgan integral indeksning tijorat banklarida moliyaviy muammolarni bir yil oldin yuqori aniqlik bilan bashorat qilishini ko‘rsatdi: uning AUC qiymati 0,86 ni, vaqtdan tashqari sinovda esa 0,95 ni tashkil etdi, an’anaviy Z-score esa O‘zbekiston sharoitida bashorat kuchiga ega emasligi aniqlandi. Indeks asosida taklif etilgan uch zonali erta ogohlantirish tizimi nazorat organiga bank muammolarini ular moliyaviy hisobotda zarar sifatida namoyon bo‘lishidan oldin aniqlash va choralarni zaiflik manbasiga qaratish imkonini beradi.</w:t>
       </w:r>
     </w:p>
-    <w:bookmarkEnd w:id="47"/>
+    <w:bookmarkEnd w:id="46"/>
     <w:sectPr>
       <w:pgMar w:left="1701" w:right="850" w:top="1134" w:bottom="1134"/>
     </w:sectPr>
@@ -6706,30 +6642,11 @@
         <w:t xml:space="preserve"> </w:t>
       </w:r>
       <w:r>
-        <w:t xml:space="preserve">Tadqiqot natijasida muallif tomonidan 4.1.2-jadvalda ko‘rsatilgan manbalar ma’lumotlari asosida hisoblandi.</w:t>
+        <w:t xml:space="preserve">Tadqiqot natijasida muallif tomonidan quyidagi manbalar ma’lumotlari asosida hisoblandi: O‘zbekiston Respublikasi Markaziy banki. Banklar statistikasi: tijorat banklarining asosiy ko‘rsatkichlari va muammoli kreditlari to‘g‘risidagi oylik ma’lumotlar, 2021-yil aprel – 2026-yil yanvar. – https://cbu.uz/uz/statistics/bankstats/; «SNS» reyting agentligi. O‘zbekiston tijorat banklarining asosiy ko‘rsatkichlari bazasi (Banks_2025_IV, Banks_2026_II): 36 bank, 2021-yil IV chorak – 2026-yil II chorak; Joint Stock Commercial Bank «Uzbek Industrial and Construction Bank» and its subsidiaries. Consolidated Financial Statements for the year ended 31 December 2025 and Independent Auditor’s Report. – Tashkent, 2026. – P. 2–3; Акционерный коммерческий банк «Узбекский промышленно-строительный банк» и его дочерние организации. Консолидированная финансовая отчетность и аудиторское заключение за годы, закончившиеся 31 декабря 2023, 2022 и 2021 гг. – Ташкент, 2024.</w:t>
       </w:r>
     </w:p>
   </w:footnote>
   <w:footnote w:id="45">
-    <w:p>
-      <w:pPr>
-        <w:pStyle w:val="FootnoteText"/>
-      </w:pPr>
-      <w:r>
-        <w:rPr>
-          <w:rStyle w:val="FootnoteReference"/>
-        </w:rPr>
-        <w:footnoteRef/>
-      </w:r>
-      <w:r>
-        <w:t xml:space="preserve"> </w:t>
-      </w:r>
-      <w:r>
-        <w:t xml:space="preserve">Tadqiqot natijasida muallif tomonidan quyidagi manbalar ma’lumotlari asosida hisoblandi: O‘zbekiston Respublikasi Markaziy banki. Banklar statistikasi: tijorat banklarining asosiy ko‘rsatkichlari va muammoli kreditlari to‘g‘risidagi oylik ma’lumotlar, 2021-yil aprel – 2026-yil yanvar. – https://cbu.uz/uz/statistics/bankstats/; «SNS» reyting agentligi. O‘zbekiston tijorat banklarining asosiy ko‘rsatkichlari bazasi (Banks_2025_IV, Banks_2026_II): 36 bank, 2021-yil IV chorak – 2026-yil II chorak; Joint Stock Commercial Bank «Uzbek Industrial and Construction Bank» and its subsidiaries. Consolidated Financial Statements for the year ended 31 December 2025 and Independent Auditor’s Report. – Tashkent, 2026. – P. 2–3; Акционерный коммерческий банк «Узбекский промышленно-строительный банк» и его дочерние организации. Консолидированная финансовая отчетность и аудиторское заключение за годы, закончившиеся 31 декабря 2023, 2022 и 2021 гг. – Ташкент, 2024.</w:t>
-      </w:r>
-    </w:p>
-  </w:footnote>
-  <w:footnote w:id="46">
     <w:p>
       <w:pPr>
         <w:pStyle w:val="FootnoteText"/>
@@ -10118,744 +10035,6 @@
               <c:strCache>
                 <c:ptCount val="1"/>
                 <c:pt idx="0">
-                  <c:v>«Biznesni rivojlantirish banki» ATB</c:v>
-                </c:pt>
-              </c:strCache>
-            </c:strRef>
-          </c:tx>
-          <c:spPr>
-            <a:ln w="28575">
-              <a:solidFill>
-                <a:srgbClr val="2A78D6"/>
-              </a:solidFill>
-            </a:ln>
-          </c:spPr>
-          <c:marker>
-            <c:symbol val="circle"/>
-            <c:size val="7"/>
-            <c:spPr>
-              <a:solidFill>
-                <a:srgbClr val="2A78D6"/>
-              </a:solidFill>
-              <a:ln>
-                <a:noFill/>
-              </a:ln>
-            </c:spPr>
-          </c:marker>
-          <c:dLbls>
-            <c:dLbl>
-              <c:idx val="0"/>
-              <c:delete val="1"/>
-            </c:dLbl>
-            <c:dLbl>
-              <c:idx val="2"/>
-              <c:delete val="1"/>
-            </c:dLbl>
-            <c:dLbl>
-              <c:idx val="4"/>
-              <c:delete val="1"/>
-            </c:dLbl>
-            <c:dLbl>
-              <c:idx val="5"/>
-              <c:delete val="1"/>
-            </c:dLbl>
-            <c:dLbl>
-              <c:idx val="6"/>
-              <c:delete val="1"/>
-            </c:dLbl>
-            <c:dLbl>
-              <c:idx val="10"/>
-              <c:delete val="1"/>
-            </c:dLbl>
-            <c:dLbl>
-              <c:idx val="11"/>
-              <c:delete val="1"/>
-            </c:dLbl>
-            <c:dLbl>
-              <c:idx val="14"/>
-              <c:delete val="1"/>
-            </c:dLbl>
-            <c:dLbl>
-              <c:idx val="15"/>
-              <c:delete val="1"/>
-            </c:dLbl>
-            <c:dLbl>
-              <c:idx val="16"/>
-              <c:delete val="1"/>
-            </c:dLbl>
-            <c:spPr>
-              <a:noFill/>
-              <a:ln>
-                <a:noFill/>
-              </a:ln>
-            </c:spPr>
-            <c:txPr>
-              <a:bodyPr/>
-              <a:lstStyle/>
-              <a:p>
-                <a:pPr>
-                  <a:defRPr sz="1000" b="1">
-                    <a:solidFill>
-                      <a:srgbClr val="2A78D6"/>
-                    </a:solidFill>
-                    <a:latin typeface="Times New Roman"/>
-                    <a:cs typeface="Times New Roman"/>
-                  </a:defRPr>
-                </a:pPr>
-                <a:endParaRPr lang="uz-Latn-UZ"/>
-              </a:p>
-            </c:txPr>
-            <c:dLblPos val="b"/>
-            <c:showLegendKey val="0"/>
-            <c:showVal val="1"/>
-            <c:showCatName val="0"/>
-            <c:showSerName val="0"/>
-            <c:showPercent val="0"/>
-            <c:showBubbleSize val="0"/>
-          </c:dLbls>
-          <c:xVal>
-            <c:numRef>
-              <c:f>Sheet1!$A$2:$A$18</c:f>
-              <c:numCache>
-                <c:formatCode>General</c:formatCode>
-                <c:ptCount val="17"/>
-                <c:pt idx="0">
-                  <c:v>2021.375</c:v>
-                </c:pt>
-                <c:pt idx="1">
-                  <c:v>2021.625</c:v>
-                </c:pt>
-                <c:pt idx="2">
-                  <c:v>2021.875</c:v>
-                </c:pt>
-                <c:pt idx="3">
-                  <c:v>2022.125</c:v>
-                </c:pt>
-                <c:pt idx="4">
-                  <c:v>2022.375</c:v>
-                </c:pt>
-                <c:pt idx="5">
-                  <c:v>2022.625</c:v>
-                </c:pt>
-                <c:pt idx="6">
-                  <c:v>2022.875</c:v>
-                </c:pt>
-                <c:pt idx="7">
-                  <c:v>2023.125</c:v>
-                </c:pt>
-                <c:pt idx="8">
-                  <c:v>2023.375</c:v>
-                </c:pt>
-                <c:pt idx="9">
-                  <c:v>2023.625</c:v>
-                </c:pt>
-                <c:pt idx="10">
-                  <c:v>2023.875</c:v>
-                </c:pt>
-                <c:pt idx="11">
-                  <c:v>2024.125</c:v>
-                </c:pt>
-                <c:pt idx="12">
-                  <c:v>2024.375</c:v>
-                </c:pt>
-                <c:pt idx="13">
-                  <c:v>2024.625</c:v>
-                </c:pt>
-                <c:pt idx="14">
-                  <c:v>2024.875</c:v>
-                </c:pt>
-                <c:pt idx="15">
-                  <c:v>2025.125</c:v>
-                </c:pt>
-                <c:pt idx="16">
-                  <c:v>2025.375</c:v>
-                </c:pt>
-              </c:numCache>
-            </c:numRef>
-          </c:xVal>
-          <c:yVal>
-            <c:numRef>
-              <c:f>Sheet1!$B$2:$B$18</c:f>
-              <c:numCache>
-                <c:formatCode>General</c:formatCode>
-                <c:ptCount val="17"/>
-                <c:pt idx="1">
-                  <c:v>2.67</c:v>
-                </c:pt>
-                <c:pt idx="2">
-                  <c:v>2.71</c:v>
-                </c:pt>
-                <c:pt idx="3">
-                  <c:v>2.93</c:v>
-                </c:pt>
-                <c:pt idx="5">
-                  <c:v>2.85</c:v>
-                </c:pt>
-                <c:pt idx="6">
-                  <c:v>2.65</c:v>
-                </c:pt>
-                <c:pt idx="7">
-                  <c:v>2.64</c:v>
-                </c:pt>
-                <c:pt idx="8">
-                  <c:v>2.44</c:v>
-                </c:pt>
-                <c:pt idx="9">
-                  <c:v>2.2</c:v>
-                </c:pt>
-                <c:pt idx="10">
-                  <c:v>2.3</c:v>
-                </c:pt>
-                <c:pt idx="11">
-                  <c:v>2.45</c:v>
-                </c:pt>
-                <c:pt idx="12">
-                  <c:v>2.83</c:v>
-                </c:pt>
-                <c:pt idx="13">
-                  <c:v>3.18</c:v>
-                </c:pt>
-                <c:pt idx="14">
-                  <c:v>3.28</c:v>
-                </c:pt>
-                <c:pt idx="15">
-                  <c:v>3.22</c:v>
-                </c:pt>
-                <c:pt idx="16">
-                  <c:v>3.15</c:v>
-                </c:pt>
-              </c:numCache>
-            </c:numRef>
-          </c:yVal>
-          <c:smooth val="0"/>
-        </c:ser>
-        <c:ser>
-          <c:idx val="1"/>
-          <c:order val="1"/>
-          <c:tx>
-            <c:strRef>
-              <c:f>Sheet1!$D$1</c:f>
-              <c:strCache>
-                <c:ptCount val="1"/>
-                <c:pt idx="0">
-                  <c:v>Qizil zona chegarasi (2,75)</c:v>
-                </c:pt>
-              </c:strCache>
-            </c:strRef>
-          </c:tx>
-          <c:spPr>
-            <a:ln w="15875">
-              <a:solidFill>
-                <a:srgbClr val="C00000"/>
-              </a:solidFill>
-              <a:prstDash val="dash"/>
-            </a:ln>
-          </c:spPr>
-          <c:marker>
-            <c:symbol val="none"/>
-          </c:marker>
-          <c:xVal>
-            <c:numRef>
-              <c:f>Sheet1!$C$2:$C$18</c:f>
-              <c:numCache>
-                <c:formatCode>General</c:formatCode>
-                <c:ptCount val="17"/>
-                <c:pt idx="0">
-                  <c:v>2021.375</c:v>
-                </c:pt>
-                <c:pt idx="1">
-                  <c:v>2021.625</c:v>
-                </c:pt>
-                <c:pt idx="2">
-                  <c:v>2021.875</c:v>
-                </c:pt>
-                <c:pt idx="3">
-                  <c:v>2022.125</c:v>
-                </c:pt>
-                <c:pt idx="4">
-                  <c:v>2022.375</c:v>
-                </c:pt>
-                <c:pt idx="5">
-                  <c:v>2022.625</c:v>
-                </c:pt>
-                <c:pt idx="6">
-                  <c:v>2022.875</c:v>
-                </c:pt>
-                <c:pt idx="7">
-                  <c:v>2023.125</c:v>
-                </c:pt>
-                <c:pt idx="8">
-                  <c:v>2023.375</c:v>
-                </c:pt>
-                <c:pt idx="9">
-                  <c:v>2023.625</c:v>
-                </c:pt>
-                <c:pt idx="10">
-                  <c:v>2023.875</c:v>
-                </c:pt>
-                <c:pt idx="11">
-                  <c:v>2024.125</c:v>
-                </c:pt>
-                <c:pt idx="12">
-                  <c:v>2024.375</c:v>
-                </c:pt>
-                <c:pt idx="13">
-                  <c:v>2024.625</c:v>
-                </c:pt>
-                <c:pt idx="14">
-                  <c:v>2024.875</c:v>
-                </c:pt>
-                <c:pt idx="15">
-                  <c:v>2025.125</c:v>
-                </c:pt>
-                <c:pt idx="16">
-                  <c:v>2025.375</c:v>
-                </c:pt>
-              </c:numCache>
-            </c:numRef>
-          </c:xVal>
-          <c:yVal>
-            <c:numRef>
-              <c:f>Sheet1!$D$2:$D$18</c:f>
-              <c:numCache>
-                <c:formatCode>General</c:formatCode>
-                <c:ptCount val="17"/>
-                <c:pt idx="0">
-                  <c:v>2.75</c:v>
-                </c:pt>
-                <c:pt idx="1">
-                  <c:v>2.75</c:v>
-                </c:pt>
-                <c:pt idx="2">
-                  <c:v>2.75</c:v>
-                </c:pt>
-                <c:pt idx="3">
-                  <c:v>2.75</c:v>
-                </c:pt>
-                <c:pt idx="4">
-                  <c:v>2.75</c:v>
-                </c:pt>
-                <c:pt idx="5">
-                  <c:v>2.75</c:v>
-                </c:pt>
-                <c:pt idx="6">
-                  <c:v>2.75</c:v>
-                </c:pt>
-                <c:pt idx="7">
-                  <c:v>2.75</c:v>
-                </c:pt>
-                <c:pt idx="8">
-                  <c:v>2.75</c:v>
-                </c:pt>
-                <c:pt idx="9">
-                  <c:v>2.75</c:v>
-                </c:pt>
-                <c:pt idx="10">
-                  <c:v>2.75</c:v>
-                </c:pt>
-                <c:pt idx="11">
-                  <c:v>2.75</c:v>
-                </c:pt>
-                <c:pt idx="12">
-                  <c:v>2.75</c:v>
-                </c:pt>
-                <c:pt idx="13">
-                  <c:v>2.75</c:v>
-                </c:pt>
-                <c:pt idx="14">
-                  <c:v>2.75</c:v>
-                </c:pt>
-                <c:pt idx="15">
-                  <c:v>2.75</c:v>
-                </c:pt>
-                <c:pt idx="16">
-                  <c:v>2.75</c:v>
-                </c:pt>
-              </c:numCache>
-            </c:numRef>
-          </c:yVal>
-          <c:smooth val="0"/>
-        </c:ser>
-        <c:ser>
-          <c:idx val="2"/>
-          <c:order val="2"/>
-          <c:tx>
-            <c:strRef>
-              <c:f>Sheet1!$F$1</c:f>
-              <c:strCache>
-                <c:ptCount val="1"/>
-                <c:pt idx="0">
-                  <c:v>Yashil zona chegarasi (3,25)</c:v>
-                </c:pt>
-              </c:strCache>
-            </c:strRef>
-          </c:tx>
-          <c:spPr>
-            <a:ln w="15875">
-              <a:solidFill>
-                <a:srgbClr val="70AD47"/>
-              </a:solidFill>
-              <a:prstDash val="dash"/>
-            </a:ln>
-          </c:spPr>
-          <c:marker>
-            <c:symbol val="none"/>
-          </c:marker>
-          <c:xVal>
-            <c:numRef>
-              <c:f>Sheet1!$E$2:$E$18</c:f>
-              <c:numCache>
-                <c:formatCode>General</c:formatCode>
-                <c:ptCount val="17"/>
-                <c:pt idx="0">
-                  <c:v>2021.375</c:v>
-                </c:pt>
-                <c:pt idx="1">
-                  <c:v>2021.625</c:v>
-                </c:pt>
-                <c:pt idx="2">
-                  <c:v>2021.875</c:v>
-                </c:pt>
-                <c:pt idx="3">
-                  <c:v>2022.125</c:v>
-                </c:pt>
-                <c:pt idx="4">
-                  <c:v>2022.375</c:v>
-                </c:pt>
-                <c:pt idx="5">
-                  <c:v>2022.625</c:v>
-                </c:pt>
-                <c:pt idx="6">
-                  <c:v>2022.875</c:v>
-                </c:pt>
-                <c:pt idx="7">
-                  <c:v>2023.125</c:v>
-                </c:pt>
-                <c:pt idx="8">
-                  <c:v>2023.375</c:v>
-                </c:pt>
-                <c:pt idx="9">
-                  <c:v>2023.625</c:v>
-                </c:pt>
-                <c:pt idx="10">
-                  <c:v>2023.875</c:v>
-                </c:pt>
-                <c:pt idx="11">
-                  <c:v>2024.125</c:v>
-                </c:pt>
-                <c:pt idx="12">
-                  <c:v>2024.375</c:v>
-                </c:pt>
-                <c:pt idx="13">
-                  <c:v>2024.625</c:v>
-                </c:pt>
-                <c:pt idx="14">
-                  <c:v>2024.875</c:v>
-                </c:pt>
-                <c:pt idx="15">
-                  <c:v>2025.125</c:v>
-                </c:pt>
-                <c:pt idx="16">
-                  <c:v>2025.375</c:v>
-                </c:pt>
-              </c:numCache>
-            </c:numRef>
-          </c:xVal>
-          <c:yVal>
-            <c:numRef>
-              <c:f>Sheet1!$F$2:$F$18</c:f>
-              <c:numCache>
-                <c:formatCode>General</c:formatCode>
-                <c:ptCount val="17"/>
-                <c:pt idx="0">
-                  <c:v>3.25</c:v>
-                </c:pt>
-                <c:pt idx="1">
-                  <c:v>3.25</c:v>
-                </c:pt>
-                <c:pt idx="2">
-                  <c:v>3.25</c:v>
-                </c:pt>
-                <c:pt idx="3">
-                  <c:v>3.25</c:v>
-                </c:pt>
-                <c:pt idx="4">
-                  <c:v>3.25</c:v>
-                </c:pt>
-                <c:pt idx="5">
-                  <c:v>3.25</c:v>
-                </c:pt>
-                <c:pt idx="6">
-                  <c:v>3.25</c:v>
-                </c:pt>
-                <c:pt idx="7">
-                  <c:v>3.25</c:v>
-                </c:pt>
-                <c:pt idx="8">
-                  <c:v>3.25</c:v>
-                </c:pt>
-                <c:pt idx="9">
-                  <c:v>3.25</c:v>
-                </c:pt>
-                <c:pt idx="10">
-                  <c:v>3.25</c:v>
-                </c:pt>
-                <c:pt idx="11">
-                  <c:v>3.25</c:v>
-                </c:pt>
-                <c:pt idx="12">
-                  <c:v>3.25</c:v>
-                </c:pt>
-                <c:pt idx="13">
-                  <c:v>3.25</c:v>
-                </c:pt>
-                <c:pt idx="14">
-                  <c:v>3.25</c:v>
-                </c:pt>
-                <c:pt idx="15">
-                  <c:v>3.25</c:v>
-                </c:pt>
-                <c:pt idx="16">
-                  <c:v>3.25</c:v>
-                </c:pt>
-              </c:numCache>
-            </c:numRef>
-          </c:yVal>
-          <c:smooth val="0"/>
-        </c:ser>
-        <c:axId val="333"/>
-        <c:axId val="444"/>
-      </c:scatterChart>
-      <c:valAx>
-        <c:axId val="333"/>
-        <c:scaling>
-          <c:orientation val="minMax"/>
-          <c:max val="2025.5"/>
-          <c:min val="2021"/>
-        </c:scaling>
-        <c:delete val="0"/>
-        <c:axPos val="b"/>
-        <c:title>
-          <c:tx>
-            <c:rich>
-              <a:bodyPr/>
-              <a:lstStyle/>
-              <a:p>
-                <a:pPr>
-                  <a:defRPr sz="1100" b="0">
-                    <a:solidFill>
-                      <a:srgbClr val="000000"/>
-                    </a:solidFill>
-                    <a:latin typeface="Times New Roman"/>
-                    <a:cs typeface="Times New Roman"/>
-                  </a:defRPr>
-                </a:pPr>
-                <a:r>
-                  <a:rPr lang="uz-Latn-UZ" sz="1100" b="0">
-                    <a:solidFill>
-                      <a:srgbClr val="000000"/>
-                    </a:solidFill>
-                    <a:latin typeface="Times New Roman"/>
-                  </a:rPr>
-                  <a:t>Yillar (choraklar)</a:t>
-                </a:r>
-              </a:p>
-            </c:rich>
-          </c:tx>
-          <c:overlay val="0"/>
-        </c:title>
-        <c:numFmt formatCode="0" sourceLinked="0"/>
-        <c:majorTickMark val="out"/>
-        <c:minorTickMark val="none"/>
-        <c:tickLblPos val="low"/>
-        <c:spPr>
-          <a:ln w="9525">
-            <a:solidFill>
-              <a:srgbClr val="595959"/>
-            </a:solidFill>
-          </a:ln>
-        </c:spPr>
-        <c:txPr>
-          <a:bodyPr rot="0" vert="horz"/>
-          <a:lstStyle/>
-          <a:p>
-            <a:pPr>
-              <a:defRPr sz="1100" b="0">
-                <a:solidFill>
-                  <a:srgbClr val="000000"/>
-                </a:solidFill>
-                <a:latin typeface="Times New Roman"/>
-                <a:cs typeface="Times New Roman"/>
-              </a:defRPr>
-            </a:pPr>
-            <a:endParaRPr lang="uz-Latn-UZ"/>
-          </a:p>
-        </c:txPr>
-        <c:crossAx val="444"/>
-        <c:crosses val="autoZero"/>
-        <c:crossBetween val="midCat"/>
-        <c:majorUnit val="1"/>
-      </c:valAx>
-      <c:valAx>
-        <c:axId val="444"/>
-        <c:scaling>
-          <c:orientation val="minMax"/>
-          <c:max val="4.0"/>
-          <c:min val="1.75"/>
-        </c:scaling>
-        <c:delete val="0"/>
-        <c:axPos val="l"/>
-        <c:majorGridlines>
-          <c:spPr>
-            <a:ln w="6350">
-              <a:solidFill>
-                <a:srgbClr val="D9D9D9"/>
-              </a:solidFill>
-            </a:ln>
-          </c:spPr>
-        </c:majorGridlines>
-        <c:title>
-          <c:tx>
-            <c:rich>
-              <a:bodyPr rot="-5400000" vert="horz"/>
-              <a:lstStyle/>
-              <a:p>
-                <a:pPr>
-                  <a:defRPr sz="1100" b="0">
-                    <a:solidFill>
-                      <a:srgbClr val="000000"/>
-                    </a:solidFill>
-                    <a:latin typeface="Times New Roman"/>
-                    <a:cs typeface="Times New Roman"/>
-                  </a:defRPr>
-                </a:pPr>
-                <a:r>
-                  <a:rPr lang="uz-Latn-UZ" sz="1100" b="0">
-                    <a:solidFill>
-                      <a:srgbClr val="000000"/>
-                    </a:solidFill>
-                    <a:latin typeface="Times New Roman"/>
-                  </a:rPr>
-                  <a:t>MBII, ball</a:t>
-                </a:r>
-              </a:p>
-            </c:rich>
-          </c:tx>
-          <c:overlay val="0"/>
-        </c:title>
-        <c:numFmt formatCode="0.00" sourceLinked="0"/>
-        <c:majorTickMark val="out"/>
-        <c:minorTickMark val="none"/>
-        <c:tickLblPos val="low"/>
-        <c:spPr>
-          <a:ln w="9525">
-            <a:solidFill>
-              <a:srgbClr val="595959"/>
-            </a:solidFill>
-          </a:ln>
-        </c:spPr>
-        <c:txPr>
-          <a:bodyPr/>
-          <a:lstStyle/>
-          <a:p>
-            <a:pPr>
-              <a:defRPr sz="1100" b="0">
-                <a:solidFill>
-                  <a:srgbClr val="000000"/>
-                </a:solidFill>
-                <a:latin typeface="Times New Roman"/>
-                <a:cs typeface="Times New Roman"/>
-              </a:defRPr>
-            </a:pPr>
-            <a:endParaRPr lang="uz-Latn-UZ"/>
-          </a:p>
-        </c:txPr>
-        <c:crossAx val="333"/>
-        <c:crosses val="autoZero"/>
-        <c:crossBetween val="midCat"/>
-        <c:majorUnit val="0.25"/>
-      </c:valAx>
-      <c:spPr>
-        <a:noFill/>
-        <a:ln>
-          <a:noFill/>
-        </a:ln>
-      </c:spPr>
-    </c:plotArea>
-    <c:legend>
-      <c:legendPos val="b"/>
-      <c:overlay val="0"/>
-      <c:txPr>
-        <a:bodyPr/>
-        <a:lstStyle/>
-        <a:p>
-          <a:pPr>
-            <a:defRPr sz="1050" b="0">
-              <a:solidFill>
-                <a:srgbClr val="000000"/>
-              </a:solidFill>
-              <a:latin typeface="Times New Roman"/>
-              <a:cs typeface="Times New Roman"/>
-            </a:defRPr>
-          </a:pPr>
-          <a:endParaRPr lang="uz-Latn-UZ"/>
-        </a:p>
-      </c:txPr>
-    </c:legend>
-    <c:plotVisOnly val="1"/>
-    <c:dispBlanksAs val="span"/>
-  </c:chart>
-  <c:spPr>
-    <a:solidFill>
-      <a:srgbClr val="FFFFFF"/>
-    </a:solidFill>
-    <a:ln>
-      <a:noFill/>
-    </a:ln>
-  </c:spPr>
-  <c:txPr>
-    <a:bodyPr/>
-    <a:lstStyle/>
-    <a:p>
-      <a:pPr>
-        <a:defRPr sz="1100" b="0">
-          <a:solidFill>
-            <a:srgbClr val="000000"/>
-          </a:solidFill>
-          <a:latin typeface="Times New Roman"/>
-          <a:cs typeface="Times New Roman"/>
-        </a:defRPr>
-      </a:pPr>
-      <a:endParaRPr lang="uz-Latn-UZ"/>
-    </a:p>
-  </c:txPr>
-  <c:externalData r:id="rId1">
-    <c:autoUpdate val="0"/>
-  </c:externalData>
-</c:chartSpace>
-</file>
-
-<file path=word/charts/chart5.xml><?xml version="1.0" encoding="utf-8"?>
-<c:chartSpace xmlns:c="http://schemas.openxmlformats.org/drawingml/2006/chart" xmlns:a="http://schemas.openxmlformats.org/drawingml/2006/main" xmlns:r="http://schemas.openxmlformats.org/officeDocument/2006/relationships">
-  <c:date1904 val="0"/>
-  <c:lang val="uz-Latn-UZ"/>
-  <c:roundedCorners val="0"/>
-  <c:chart>
-    <c:autoTitleDeleted val="1"/>
-    <c:plotArea>
-      <c:layout/>
-      <c:scatterChart>
-        <c:scatterStyle val="lineMarker"/>
-        <c:varyColors val="0"/>
-        <c:ser>
-          <c:idx val="0"/>
-          <c:order val="0"/>
-          <c:tx>
-            <c:strRef>
-              <c:f>Sheet1!$B$1</c:f>
-              <c:strCache>
-                <c:ptCount val="1"/>
-                <c:pt idx="0">
                   <c:v>SQB: milliy hisobot asosida (choraklik)</c:v>
                 </c:pt>
               </c:strCache>

</xml_diff>